<commit_message>
Update portfolio from latest resume and add professional headshot.
</commit_message>
<xml_diff>
--- a/Website/Personal/Surya_Singh_Resume.docx
+++ b/Website/Personal/Surya_Singh_Resume.docx
@@ -222,7 +222,7 @@
         <w:t>PROFESSIONAL SUMMARY</w:t>
       </w:r>
     </w:p>
-    <w:p xmlns:wp14="http://schemas.microsoft.com/office/word/2010/wordml" wp14:textId="41C0271B">
+    <w:p xmlns:wp14="http://schemas.microsoft.com/office/word/2010/wordml" wp14:textId="50263808">
       <w:pPr>
         <w:pStyle w:val="Normal"/>
         <w:spacing w:before="60" w:beforeAutospacing="off" w:after="60" w:afterAutospacing="off" w:line="259" w:lineRule="auto"/>
@@ -251,17 +251,117 @@
           <w:szCs w:val="19"/>
           <w:lang w:val="en-US"/>
         </w:rPr>
-        <w:t xml:space="preserve">Senior AI-Augmented </w:t>
-      </w:r>
-      <w:r>
-        <w:rPr>
-          <w:rFonts w:ascii="Calibri" w:hAnsi="Calibri" w:eastAsia="Calibri" w:cs="Calibri"/>
-          <w:color w:val="000000"/>
-          <w:sz w:val="19"/>
-          <w:szCs w:val="19"/>
-          <w:lang w:val="en-US"/>
-        </w:rPr>
-        <w:t>.NET Developer</w:t>
+        <w:t>Senior AI-Augmented .NET Developer / Solution Architect with 1</w:t>
+      </w:r>
+      <w:r>
+        <w:rPr>
+          <w:rFonts w:ascii="Calibri" w:hAnsi="Calibri" w:eastAsia="Calibri" w:cs="Calibri"/>
+          <w:color w:val="000000"/>
+          <w:sz w:val="19"/>
+          <w:szCs w:val="19"/>
+          <w:lang w:val="en-US"/>
+        </w:rPr>
+        <w:t>5</w:t>
+      </w:r>
+      <w:r>
+        <w:rPr>
+          <w:rFonts w:ascii="Calibri" w:hAnsi="Calibri" w:eastAsia="Calibri" w:cs="Calibri"/>
+          <w:color w:val="000000"/>
+          <w:sz w:val="19"/>
+          <w:szCs w:val="19"/>
+          <w:lang w:val="en-US"/>
+        </w:rPr>
+        <w:t>+ years of hands-on experience building enterprise-grade applications using C#, ASP.NET MVC, ASP.NET Core, .NET Core Web APIs, React, Azure, and AI-assisted SDLC tooling (Cursor, Claude Code,</w:t>
+      </w:r>
+      <w:r>
+        <w:rPr>
+          <w:rFonts w:ascii="Calibri" w:hAnsi="Calibri" w:eastAsia="Calibri" w:cs="Calibri"/>
+          <w:color w:val="000000"/>
+          <w:sz w:val="19"/>
+          <w:szCs w:val="19"/>
+          <w:lang w:val="en-US"/>
+        </w:rPr>
+        <w:t xml:space="preserve"> GitHub Copilot, Amazon Q,</w:t>
+      </w:r>
+      <w:r>
+        <w:rPr>
+          <w:rFonts w:ascii="Calibri" w:hAnsi="Calibri" w:eastAsia="Calibri" w:cs="Calibri"/>
+          <w:color w:val="000000"/>
+          <w:sz w:val="19"/>
+          <w:szCs w:val="19"/>
+          <w:lang w:val="en-US"/>
+        </w:rPr>
+        <w:t xml:space="preserve"> MCP). </w:t>
+      </w:r>
+      <w:r>
+        <w:rPr>
+          <w:rFonts w:ascii="Calibri" w:hAnsi="Calibri" w:eastAsia="Calibri" w:cs="Calibri"/>
+          <w:color w:val="000000"/>
+          <w:sz w:val="19"/>
+          <w:szCs w:val="19"/>
+          <w:lang w:val="en-US"/>
+        </w:rPr>
+        <w:t xml:space="preserve">Operates as a forward deployed engineer –embedded </w:t>
+      </w:r>
+      <w:r>
+        <w:rPr>
+          <w:rFonts w:ascii="Calibri" w:hAnsi="Calibri" w:eastAsia="Calibri" w:cs="Calibri"/>
+          <w:color w:val="000000"/>
+          <w:sz w:val="19"/>
+          <w:szCs w:val="19"/>
+          <w:lang w:val="en-US"/>
+        </w:rPr>
+        <w:t xml:space="preserve">directly inside </w:t>
+      </w:r>
+      <w:r>
+        <w:rPr>
+          <w:rFonts w:ascii="Calibri" w:hAnsi="Calibri" w:eastAsia="Calibri" w:cs="Calibri"/>
+          <w:color w:val="000000"/>
+          <w:sz w:val="19"/>
+          <w:szCs w:val="19"/>
+          <w:lang w:val="en-US"/>
+        </w:rPr>
+        <w:t>client’s</w:t>
+      </w:r>
+      <w:r>
+        <w:rPr>
+          <w:rFonts w:ascii="Calibri" w:hAnsi="Calibri" w:eastAsia="Calibri" w:cs="Calibri"/>
+          <w:color w:val="000000"/>
+          <w:sz w:val="19"/>
+          <w:szCs w:val="19"/>
+          <w:lang w:val="en-US"/>
+        </w:rPr>
+        <w:t xml:space="preserve"> engineering team</w:t>
+      </w:r>
+      <w:r>
+        <w:rPr>
+          <w:rFonts w:ascii="Calibri" w:hAnsi="Calibri" w:eastAsia="Calibri" w:cs="Calibri"/>
+          <w:color w:val="000000"/>
+          <w:sz w:val="19"/>
+          <w:szCs w:val="19"/>
+          <w:lang w:val="en-US"/>
+        </w:rPr>
+        <w:t xml:space="preserve"> building and shipping custom </w:t>
+      </w:r>
+      <w:r>
+        <w:rPr>
+          <w:rFonts w:ascii="Calibri" w:hAnsi="Calibri" w:eastAsia="Calibri" w:cs="Calibri"/>
+          <w:color w:val="000000"/>
+          <w:sz w:val="19"/>
+          <w:szCs w:val="19"/>
+          <w:lang w:val="en-US"/>
+        </w:rPr>
+        <w:t>solutions</w:t>
+      </w:r>
+      <w:r>
+        <w:rPr>
+          <w:rFonts w:ascii="Calibri" w:hAnsi="Calibri" w:eastAsia="Calibri" w:cs="Calibri"/>
+          <w:color w:val="000000"/>
+          <w:sz w:val="19"/>
+          <w:szCs w:val="19"/>
+          <w:lang w:val="en-US"/>
+        </w:rPr>
+        <w:t>.</w:t>
       </w:r>
       <w:r>
         <w:rPr>
@@ -281,157 +381,419 @@
           <w:szCs w:val="19"/>
           <w:lang w:val="en-US"/>
         </w:rPr>
-        <w:t xml:space="preserve">with 11+ </w:t>
-      </w:r>
-      <w:r>
-        <w:rPr>
-          <w:rFonts w:ascii="Calibri" w:hAnsi="Calibri" w:eastAsia="Calibri" w:cs="Calibri"/>
-          <w:color w:val="000000"/>
-          <w:sz w:val="19"/>
-          <w:szCs w:val="19"/>
-          <w:lang w:val="en-US"/>
-        </w:rPr>
-        <w:t>years of</w:t>
-      </w:r>
-      <w:r>
-        <w:rPr>
-          <w:rFonts w:ascii="Calibri" w:hAnsi="Calibri" w:eastAsia="Calibri" w:cs="Calibri"/>
-          <w:color w:val="000000"/>
-          <w:sz w:val="19"/>
-          <w:szCs w:val="19"/>
-          <w:lang w:val="en-US"/>
-        </w:rPr>
-        <w:t xml:space="preserve"> hands-on </w:t>
-      </w:r>
-      <w:r>
-        <w:rPr>
-          <w:rFonts w:ascii="Calibri" w:hAnsi="Calibri" w:eastAsia="Calibri" w:cs="Calibri"/>
-          <w:color w:val="000000"/>
-          <w:sz w:val="19"/>
-          <w:szCs w:val="19"/>
-          <w:lang w:val="en-US"/>
-        </w:rPr>
-        <w:t>experience</w:t>
-      </w:r>
-      <w:r>
-        <w:rPr>
-          <w:rFonts w:ascii="Calibri" w:hAnsi="Calibri" w:eastAsia="Calibri" w:cs="Calibri"/>
-          <w:color w:val="000000"/>
-          <w:sz w:val="19"/>
-          <w:szCs w:val="19"/>
-          <w:lang w:val="en-US"/>
-        </w:rPr>
-        <w:t xml:space="preserve"> in</w:t>
-      </w:r>
-      <w:r>
-        <w:rPr>
-          <w:rFonts w:ascii="Calibri" w:hAnsi="Calibri" w:eastAsia="Calibri" w:cs="Calibri"/>
-          <w:color w:val="000000"/>
-          <w:sz w:val="19"/>
-          <w:szCs w:val="19"/>
-          <w:lang w:val="en-US"/>
-        </w:rPr>
-        <w:t xml:space="preserve"> </w:t>
-      </w:r>
-      <w:r>
-        <w:rPr>
-          <w:rFonts w:ascii="Calibri" w:hAnsi="Calibri" w:eastAsia="Calibri" w:cs="Calibri"/>
-          <w:color w:val="000000"/>
-          <w:sz w:val="19"/>
-          <w:szCs w:val="19"/>
-          <w:lang w:val="en-US"/>
-        </w:rPr>
-        <w:t>delivering</w:t>
-      </w:r>
-      <w:r>
-        <w:rPr>
-          <w:rFonts w:ascii="Calibri" w:hAnsi="Calibri" w:eastAsia="Calibri" w:cs="Calibri"/>
-          <w:color w:val="000000"/>
-          <w:sz w:val="19"/>
-          <w:szCs w:val="19"/>
-          <w:lang w:val="en-US"/>
-        </w:rPr>
-        <w:t xml:space="preserve"> </w:t>
-      </w:r>
-      <w:r>
-        <w:rPr>
-          <w:rFonts w:ascii="Calibri" w:hAnsi="Calibri" w:eastAsia="Calibri" w:cs="Calibri"/>
-          <w:color w:val="000000"/>
-          <w:sz w:val="19"/>
-          <w:szCs w:val="19"/>
-          <w:lang w:val="en-US"/>
-        </w:rPr>
-        <w:t>enterprise applications</w:t>
-      </w:r>
-      <w:r>
-        <w:rPr>
-          <w:rFonts w:ascii="Calibri" w:hAnsi="Calibri" w:eastAsia="Calibri" w:cs="Calibri"/>
-          <w:color w:val="000000"/>
-          <w:sz w:val="19"/>
-          <w:szCs w:val="19"/>
-          <w:lang w:val="en-US"/>
-        </w:rPr>
-        <w:t xml:space="preserve"> in C#, </w:t>
-      </w:r>
-      <w:r>
-        <w:rPr>
-          <w:rFonts w:ascii="Calibri" w:hAnsi="Calibri" w:eastAsia="Calibri" w:cs="Calibri"/>
-          <w:color w:val="000000"/>
-          <w:sz w:val="19"/>
-          <w:szCs w:val="19"/>
-          <w:lang w:val="en-US"/>
-        </w:rPr>
-        <w:t xml:space="preserve">Python, </w:t>
-      </w:r>
-      <w:r>
-        <w:rPr>
-          <w:rFonts w:ascii="Calibri" w:hAnsi="Calibri" w:eastAsia="Calibri" w:cs="Calibri"/>
-          <w:color w:val="000000"/>
-          <w:sz w:val="19"/>
-          <w:szCs w:val="19"/>
-          <w:lang w:val="en-US"/>
-        </w:rPr>
-        <w:t>ASP.NET</w:t>
-      </w:r>
-      <w:r>
-        <w:rPr>
-          <w:rFonts w:ascii="Calibri" w:hAnsi="Calibri" w:eastAsia="Calibri" w:cs="Calibri"/>
-          <w:color w:val="000000"/>
-          <w:sz w:val="19"/>
-          <w:szCs w:val="19"/>
-          <w:lang w:val="en-US"/>
-        </w:rPr>
-        <w:t xml:space="preserve"> Core, .NET Core Web API, and Azure. Practitioner </w:t>
-      </w:r>
-      <w:r>
-        <w:rPr>
-          <w:rFonts w:ascii="Calibri" w:hAnsi="Calibri" w:eastAsia="Calibri" w:cs="Calibri"/>
-          <w:color w:val="000000"/>
-          <w:sz w:val="19"/>
-          <w:szCs w:val="19"/>
-          <w:lang w:val="en-US"/>
-        </w:rPr>
-        <w:t>for</w:t>
-      </w:r>
-      <w:r>
-        <w:rPr>
-          <w:rFonts w:ascii="Calibri" w:hAnsi="Calibri" w:eastAsia="Calibri" w:cs="Calibri"/>
-          <w:color w:val="000000"/>
-          <w:sz w:val="19"/>
-          <w:szCs w:val="19"/>
-          <w:lang w:val="en-US"/>
-        </w:rPr>
-        <w:t xml:space="preserve"> AI-augmented SDLC using Claude Code, Cursor IDE, GitHub Copilot, and custom MCP servers. </w:t>
-      </w:r>
-      <w:r>
-        <w:rPr>
-          <w:rFonts w:ascii="Calibri" w:hAnsi="Calibri" w:eastAsia="Calibri" w:cs="Calibri"/>
-          <w:color w:val="000000"/>
-          <w:sz w:val="19"/>
-          <w:szCs w:val="19"/>
-          <w:lang w:val="en-US"/>
-        </w:rPr>
-        <w:t xml:space="preserve">Holds a master's degree in computer applications. </w:t>
+        <w:t xml:space="preserve">Has contributed to renowned IT organizations </w:t>
+      </w:r>
+      <w:r>
+        <w:rPr>
+          <w:rFonts w:ascii="Calibri" w:hAnsi="Calibri" w:eastAsia="Calibri" w:cs="Calibri"/>
+          <w:color w:val="000000"/>
+          <w:sz w:val="19"/>
+          <w:szCs w:val="19"/>
+          <w:lang w:val="en-US"/>
+        </w:rPr>
+        <w:t>including Tata</w:t>
+      </w:r>
+      <w:r>
+        <w:rPr>
+          <w:rFonts w:ascii="Calibri" w:hAnsi="Calibri" w:eastAsia="Calibri" w:cs="Calibri"/>
+          <w:color w:val="000000"/>
+          <w:sz w:val="19"/>
+          <w:szCs w:val="19"/>
+          <w:lang w:val="en-US"/>
+        </w:rPr>
+        <w:t xml:space="preserve"> Consultancy Services (TCS), HCL Technologies, NIIT Technologies, Collabera Inc., Randstad Technologies USA, SEW USA</w:t>
+      </w:r>
+      <w:r>
+        <w:rPr>
+          <w:rFonts w:ascii="Calibri" w:hAnsi="Calibri" w:eastAsia="Calibri" w:cs="Calibri"/>
+          <w:color w:val="000000"/>
+          <w:sz w:val="19"/>
+          <w:szCs w:val="19"/>
+          <w:lang w:val="en-US"/>
+        </w:rPr>
+        <w:t xml:space="preserve"> and Neilson Financial Services</w:t>
+      </w:r>
+      <w:r>
+        <w:rPr>
+          <w:rFonts w:ascii="Calibri" w:hAnsi="Calibri" w:eastAsia="Calibri" w:cs="Calibri"/>
+          <w:color w:val="000000"/>
+          <w:sz w:val="19"/>
+          <w:szCs w:val="19"/>
+          <w:lang w:val="en-US"/>
+        </w:rPr>
+        <w:t xml:space="preserve">. Successfully held diverse roles including Software Developer, Senior Developer, Technical Lead, and Project Lead. Broad domain </w:t>
+      </w:r>
+      <w:r>
+        <w:rPr>
+          <w:rFonts w:ascii="Calibri" w:hAnsi="Calibri" w:eastAsia="Calibri" w:cs="Calibri"/>
+          <w:color w:val="000000"/>
+          <w:sz w:val="19"/>
+          <w:szCs w:val="19"/>
+          <w:lang w:val="en-US"/>
+        </w:rPr>
+        <w:t>expertise</w:t>
+      </w:r>
+      <w:r>
+        <w:rPr>
+          <w:rFonts w:ascii="Calibri" w:hAnsi="Calibri" w:eastAsia="Calibri" w:cs="Calibri"/>
+          <w:color w:val="000000"/>
+          <w:sz w:val="19"/>
+          <w:szCs w:val="19"/>
+          <w:lang w:val="en-US"/>
+        </w:rPr>
+        <w:t xml:space="preserve"> spanning BFSI, Insurance, Travel, Hi-Tech, Retail, Utilities, Healthcare, and Enterprise HR/Payroll. Experienced designing Microservices architectures following Domain-Driven Design (DDD), with </w:t>
+      </w:r>
+      <w:r>
+        <w:rPr>
+          <w:rFonts w:ascii="Calibri" w:hAnsi="Calibri" w:eastAsia="Calibri" w:cs="Calibri"/>
+          <w:color w:val="000000"/>
+          <w:sz w:val="19"/>
+          <w:szCs w:val="19"/>
+          <w:lang w:val="en-US"/>
+        </w:rPr>
+        <w:t>a strong foundation</w:t>
+      </w:r>
+      <w:r>
+        <w:rPr>
+          <w:rFonts w:ascii="Calibri" w:hAnsi="Calibri" w:eastAsia="Calibri" w:cs="Calibri"/>
+          <w:color w:val="000000"/>
+          <w:sz w:val="19"/>
+          <w:szCs w:val="19"/>
+          <w:lang w:val="en-US"/>
+        </w:rPr>
+        <w:t xml:space="preserve"> in OOAD/UML, requirement analysis, solution design, and application architecture applying SOLID and design patterns (Creational, Structural, Behavioral). Strong </w:t>
+      </w:r>
+      <w:r>
+        <w:rPr>
+          <w:rFonts w:ascii="Calibri" w:hAnsi="Calibri" w:eastAsia="Calibri" w:cs="Calibri"/>
+          <w:color w:val="000000"/>
+          <w:sz w:val="19"/>
+          <w:szCs w:val="19"/>
+          <w:lang w:val="en-US"/>
+        </w:rPr>
+        <w:t>proficiency</w:t>
+      </w:r>
+      <w:r>
+        <w:rPr>
+          <w:rFonts w:ascii="Calibri" w:hAnsi="Calibri" w:eastAsia="Calibri" w:cs="Calibri"/>
+          <w:color w:val="000000"/>
+          <w:sz w:val="19"/>
+          <w:szCs w:val="19"/>
+          <w:lang w:val="en-US"/>
+        </w:rPr>
+        <w:t xml:space="preserve"> in relational SQL and NoSQL data modeling, REST API design/security/</w:t>
+      </w:r>
+      <w:r>
+        <w:rPr>
+          <w:rFonts w:ascii="Calibri" w:hAnsi="Calibri" w:eastAsia="Calibri" w:cs="Calibri"/>
+          <w:color w:val="000000"/>
+          <w:sz w:val="19"/>
+          <w:szCs w:val="19"/>
+          <w:lang w:val="en-US"/>
+        </w:rPr>
+        <w:t>documentation</w:t>
+      </w:r>
+      <w:r>
+        <w:rPr>
+          <w:rFonts w:ascii="Calibri" w:hAnsi="Calibri" w:eastAsia="Calibri" w:cs="Calibri"/>
+          <w:color w:val="000000"/>
+          <w:sz w:val="19"/>
+          <w:szCs w:val="19"/>
+          <w:lang w:val="en-US"/>
+        </w:rPr>
+        <w:t xml:space="preserve"> a</w:t>
+      </w:r>
+      <w:r>
+        <w:rPr>
+          <w:rFonts w:ascii="Calibri" w:hAnsi="Calibri" w:eastAsia="Calibri" w:cs="Calibri"/>
+          <w:color w:val="000000"/>
+          <w:sz w:val="19"/>
+          <w:szCs w:val="19"/>
+          <w:lang w:val="en-US"/>
+        </w:rPr>
+        <w:t>nd front-end delivery with HTML5, JavaScript (ES6+), React,</w:t>
+      </w:r>
+      <w:r>
+        <w:rPr>
+          <w:rFonts w:ascii="Calibri" w:hAnsi="Calibri" w:eastAsia="Calibri" w:cs="Calibri"/>
+          <w:color w:val="000000"/>
+          <w:sz w:val="19"/>
+          <w:szCs w:val="19"/>
+          <w:lang w:val="en-US"/>
+        </w:rPr>
+        <w:t xml:space="preserve"> Angular, </w:t>
+      </w:r>
+      <w:r>
+        <w:rPr>
+          <w:rFonts w:ascii="Calibri" w:hAnsi="Calibri" w:eastAsia="Calibri" w:cs="Calibri"/>
+          <w:color w:val="000000"/>
+          <w:sz w:val="19"/>
+          <w:szCs w:val="19"/>
+          <w:lang w:val="en-US"/>
+        </w:rPr>
+        <w:t>VueJs</w:t>
+      </w:r>
+      <w:r>
+        <w:rPr>
+          <w:rFonts w:ascii="Calibri" w:hAnsi="Calibri" w:eastAsia="Calibri" w:cs="Calibri"/>
+          <w:color w:val="000000"/>
+          <w:sz w:val="19"/>
+          <w:szCs w:val="19"/>
+          <w:lang w:val="en-US"/>
+        </w:rPr>
+        <w:t>,</w:t>
+      </w:r>
+      <w:r>
+        <w:rPr>
+          <w:rFonts w:ascii="Calibri" w:hAnsi="Calibri" w:eastAsia="Calibri" w:cs="Calibri"/>
+          <w:color w:val="000000"/>
+          <w:sz w:val="19"/>
+          <w:szCs w:val="19"/>
+          <w:lang w:val="en-US"/>
+        </w:rPr>
+        <w:t xml:space="preserve"> jQuery, and CSS. Spearheaded </w:t>
+      </w:r>
+      <w:r>
+        <w:rPr>
+          <w:rFonts w:ascii="Calibri" w:hAnsi="Calibri" w:eastAsia="Calibri" w:cs="Calibri"/>
+          <w:color w:val="000000"/>
+          <w:sz w:val="19"/>
+          <w:szCs w:val="19"/>
+          <w:lang w:val="en-US"/>
+        </w:rPr>
+        <w:t>DataDog</w:t>
+      </w:r>
+      <w:r>
+        <w:rPr>
+          <w:rFonts w:ascii="Calibri" w:hAnsi="Calibri" w:eastAsia="Calibri" w:cs="Calibri"/>
+          <w:color w:val="000000"/>
+          <w:sz w:val="19"/>
+          <w:szCs w:val="19"/>
+          <w:lang w:val="en-US"/>
+        </w:rPr>
+        <w:t xml:space="preserve"> observability and NuGet instrumentation packages across platforms. Experienced in Agile product development with excellent problem-solving and communication skills. Proven delivery across </w:t>
+      </w:r>
+      <w:r>
+        <w:rPr>
+          <w:rFonts w:ascii="Calibri" w:hAnsi="Calibri" w:eastAsia="Calibri" w:cs="Calibri"/>
+          <w:color w:val="000000"/>
+          <w:sz w:val="19"/>
+          <w:szCs w:val="19"/>
+          <w:lang w:val="en-US"/>
+        </w:rPr>
+        <w:t>USA</w:t>
+      </w:r>
+      <w:r>
+        <w:rPr>
+          <w:rFonts w:ascii="Calibri" w:hAnsi="Calibri" w:eastAsia="Calibri" w:cs="Calibri"/>
+          <w:color w:val="000000"/>
+          <w:sz w:val="19"/>
+          <w:szCs w:val="19"/>
+          <w:lang w:val="en-US"/>
+        </w:rPr>
+        <w:t xml:space="preserve"> and UK</w:t>
+      </w:r>
+      <w:r>
+        <w:rPr>
+          <w:rFonts w:ascii="Calibri" w:hAnsi="Calibri" w:eastAsia="Calibri" w:cs="Calibri"/>
+          <w:color w:val="000000"/>
+          <w:sz w:val="19"/>
+          <w:szCs w:val="19"/>
+          <w:lang w:val="en-US"/>
+        </w:rPr>
+        <w:t xml:space="preserve"> with </w:t>
+      </w:r>
+      <w:r>
+        <w:rPr>
+          <w:rFonts w:ascii="Calibri" w:hAnsi="Calibri" w:eastAsia="Calibri" w:cs="Calibri"/>
+          <w:color w:val="000000"/>
+          <w:sz w:val="19"/>
+          <w:szCs w:val="19"/>
+          <w:lang w:val="en-US"/>
+        </w:rPr>
+        <w:t>Fortune</w:t>
+      </w:r>
+      <w:r>
+        <w:rPr>
+          <w:rFonts w:ascii="Calibri" w:hAnsi="Calibri" w:eastAsia="Calibri" w:cs="Calibri"/>
+          <w:color w:val="000000"/>
+          <w:sz w:val="19"/>
+          <w:szCs w:val="19"/>
+          <w:lang w:val="en-US"/>
+        </w:rPr>
+        <w:t xml:space="preserve"> 500 global customers</w:t>
+      </w:r>
+      <w:r>
+        <w:rPr>
+          <w:rFonts w:ascii="Calibri" w:hAnsi="Calibri" w:eastAsia="Calibri" w:cs="Calibri"/>
+          <w:color w:val="000000"/>
+          <w:sz w:val="19"/>
+          <w:szCs w:val="19"/>
+          <w:lang w:val="en-US"/>
+        </w:rPr>
+        <w:t>.</w:t>
+      </w:r>
+      <w:r>
+        <w:rPr>
+          <w:rFonts w:ascii="Calibri" w:hAnsi="Calibri" w:eastAsia="Calibri" w:cs="Calibri"/>
+          <w:color w:val="000000"/>
+          <w:sz w:val="19"/>
+          <w:szCs w:val="19"/>
+          <w:lang w:val="en-US"/>
+        </w:rPr>
+      </w:r>
+      <w:r>
+        <w:rPr>
+          <w:rFonts w:ascii="Calibri" w:hAnsi="Calibri" w:eastAsia="Calibri" w:cs="Calibri"/>
+          <w:color w:val="000000"/>
+          <w:sz w:val="19"/>
+          <w:szCs w:val="19"/>
+          <w:lang w:val="en-US"/>
+        </w:rPr>
+      </w:r>
+      <w:r>
+        <w:rPr>
+          <w:rFonts w:ascii="Calibri" w:hAnsi="Calibri" w:eastAsia="Calibri" w:cs="Calibri"/>
+          <w:color w:val="000000"/>
+          <w:sz w:val="19"/>
+          <w:szCs w:val="19"/>
+          <w:lang w:val="en-US"/>
+        </w:rPr>
+      </w:r>
+      <w:r>
+        <w:rPr>
+          <w:rFonts w:ascii="Calibri" w:hAnsi="Calibri" w:eastAsia="Calibri" w:cs="Calibri"/>
+          <w:color w:val="000000"/>
+          <w:sz w:val="19"/>
+          <w:szCs w:val="19"/>
+          <w:lang w:val="en-US"/>
+        </w:rPr>
+      </w:r>
+      <w:r>
+        <w:rPr>
+          <w:rFonts w:ascii="Calibri" w:hAnsi="Calibri" w:eastAsia="Calibri" w:cs="Calibri"/>
+          <w:color w:val="000000"/>
+          <w:sz w:val="19"/>
+          <w:szCs w:val="19"/>
+          <w:lang w:val="en-US"/>
+        </w:rPr>
+      </w:r>
+      <w:r>
+        <w:rPr>
+          <w:rFonts w:ascii="Calibri" w:hAnsi="Calibri" w:eastAsia="Calibri" w:cs="Calibri"/>
+          <w:color w:val="000000"/>
+          <w:sz w:val="19"/>
+          <w:szCs w:val="19"/>
+          <w:lang w:val="en-US"/>
+        </w:rPr>
+      </w:r>
+      <w:r>
+        <w:rPr>
+          <w:rFonts w:ascii="Calibri" w:hAnsi="Calibri" w:eastAsia="Calibri" w:cs="Calibri"/>
+          <w:color w:val="000000"/>
+          <w:sz w:val="19"/>
+          <w:szCs w:val="19"/>
+          <w:lang w:val="en-US"/>
+        </w:rPr>
+      </w:r>
+      <w:r>
+        <w:rPr>
+          <w:rFonts w:ascii="Calibri" w:hAnsi="Calibri" w:eastAsia="Calibri" w:cs="Calibri"/>
+          <w:color w:val="000000"/>
+          <w:sz w:val="19"/>
+          <w:szCs w:val="19"/>
+          <w:lang w:val="en-US"/>
+        </w:rPr>
+      </w:r>
+      <w:r>
+        <w:rPr>
+          <w:rFonts w:ascii="Calibri" w:hAnsi="Calibri" w:eastAsia="Calibri" w:cs="Calibri"/>
+          <w:color w:val="000000"/>
+          <w:sz w:val="19"/>
+          <w:szCs w:val="19"/>
+          <w:lang w:val="en-US"/>
+        </w:rPr>
+      </w:r>
+      <w:r>
+        <w:rPr>
+          <w:rFonts w:ascii="Calibri" w:hAnsi="Calibri" w:eastAsia="Calibri" w:cs="Calibri"/>
+          <w:color w:val="000000"/>
+          <w:sz w:val="19"/>
+          <w:szCs w:val="19"/>
+          <w:lang w:val="en-US"/>
+        </w:rPr>
+      </w:r>
+      <w:r>
+        <w:rPr>
+          <w:rFonts w:ascii="Calibri" w:hAnsi="Calibri" w:eastAsia="Calibri" w:cs="Calibri"/>
+          <w:color w:val="000000"/>
+          <w:sz w:val="19"/>
+          <w:szCs w:val="19"/>
+          <w:lang w:val="en-US"/>
+        </w:rPr>
+      </w:r>
+      <w:r>
+        <w:rPr>
+          <w:rFonts w:ascii="Calibri" w:hAnsi="Calibri" w:eastAsia="Calibri" w:cs="Calibri"/>
+          <w:color w:val="000000"/>
+          <w:sz w:val="19"/>
+          <w:szCs w:val="19"/>
+          <w:lang w:val="en-US"/>
+        </w:rPr>
+      </w:r>
+      <w:r>
+        <w:rPr>
+          <w:rFonts w:ascii="Calibri" w:hAnsi="Calibri" w:eastAsia="Calibri" w:cs="Calibri"/>
+          <w:color w:val="000000"/>
+          <w:sz w:val="19"/>
+          <w:szCs w:val="19"/>
+          <w:lang w:val="en-US"/>
+        </w:rPr>
+      </w:r>
+      <w:r>
+        <w:rPr>
+          <w:rFonts w:ascii="Calibri" w:hAnsi="Calibri" w:eastAsia="Calibri" w:cs="Calibri"/>
+          <w:color w:val="000000"/>
+          <w:sz w:val="19"/>
+          <w:szCs w:val="19"/>
+          <w:lang w:val="en-US"/>
+        </w:rPr>
+      </w:r>
+      <w:r>
+        <w:rPr>
+          <w:rFonts w:ascii="Calibri" w:hAnsi="Calibri" w:eastAsia="Calibri" w:cs="Calibri"/>
+          <w:color w:val="000000"/>
+          <w:sz w:val="19"/>
+          <w:szCs w:val="19"/>
+          <w:lang w:val="en-US"/>
+        </w:rPr>
+      </w:r>
+      <w:r>
+        <w:rPr>
+          <w:rFonts w:ascii="Calibri" w:hAnsi="Calibri" w:eastAsia="Calibri" w:cs="Calibri"/>
+          <w:color w:val="000000"/>
+          <w:sz w:val="19"/>
+          <w:szCs w:val="19"/>
+          <w:lang w:val="en-US"/>
+        </w:rPr>
+      </w:r>
+      <w:r>
+        <w:rPr>
+          <w:rFonts w:ascii="Calibri" w:hAnsi="Calibri" w:eastAsia="Calibri" w:cs="Calibri"/>
+          <w:color w:val="000000"/>
+          <w:sz w:val="19"/>
+          <w:szCs w:val="19"/>
+          <w:lang w:val="en-US"/>
+        </w:rPr>
+      </w:r>
+      <w:r>
+        <w:rPr>
+          <w:rFonts w:ascii="Calibri" w:hAnsi="Calibri" w:eastAsia="Calibri" w:cs="Calibri"/>
+          <w:color w:val="000000"/>
+          <w:sz w:val="19"/>
+          <w:szCs w:val="19"/>
+          <w:lang w:val="en-US"/>
+        </w:rPr>
       </w:r>
       <w:r>
         <w:rPr>
@@ -448,7 +810,6 @@
           <w:szCs w:val="19"/>
           <w:lang w:val="en-US"/>
         </w:rPr>
-        <w:t xml:space="preserve">Has contributed to renowned IT organizations including Tata Consultancy Services (TCS), HCL Technologies, NIIT Technologies, Collabera Inc., Randstad Technologies USA, and SEW USA. </w:t>
       </w:r>
       <w:r>
         <w:rPr>
@@ -465,7 +826,6 @@
           <w:szCs w:val="19"/>
           <w:lang w:val="en-US"/>
         </w:rPr>
-        <w:t>Experienced</w:t>
       </w:r>
       <w:r>
         <w:rPr>
@@ -482,7 +842,6 @@
           <w:szCs w:val="19"/>
           <w:lang w:val="en-US"/>
         </w:rPr>
-        <w:t xml:space="preserve"> in designing and developing Microservices-based architectures following Domain-Driven Design (DDD) principles, with </w:t>
       </w:r>
       <w:r>
         <w:rPr>
@@ -499,7 +858,6 @@
           <w:szCs w:val="19"/>
           <w:lang w:val="en-US"/>
         </w:rPr>
-        <w:t>a strong foundation</w:t>
       </w:r>
       <w:r>
         <w:rPr>
@@ -516,7 +874,6 @@
           <w:szCs w:val="19"/>
           <w:lang w:val="en-US"/>
         </w:rPr>
-        <w:t xml:space="preserve"> in Object-Oriented Analysis and Design (OOAD) and UML. Followed agile </w:t>
       </w:r>
       <w:r>
         <w:rPr>
@@ -533,7 +890,6 @@
           <w:szCs w:val="19"/>
           <w:lang w:val="en-US"/>
         </w:rPr>
-        <w:t>methodology</w:t>
       </w:r>
       <w:r>
         <w:rPr>
@@ -550,7 +906,6 @@
           <w:szCs w:val="19"/>
           <w:lang w:val="en-US"/>
         </w:rPr>
-        <w:t xml:space="preserve"> and skilled in requirement analysis, solution design, and application architecture, applying SOLID principles and design patterns including Creational (Singleton, Factory, Abstract Factory), Structural (Adapter, Decorator), and Behavioral (Strategy, Observer</w:t>
       </w:r>
       <w:r>
         <w:rPr>
@@ -567,7 +922,6 @@
           <w:szCs w:val="19"/>
           <w:lang w:val="en-US"/>
         </w:rPr>
-        <w:t>). Solid</w:t>
       </w:r>
       <w:r>
         <w:rPr>
@@ -584,7 +938,6 @@
           <w:szCs w:val="19"/>
           <w:lang w:val="en-US"/>
         </w:rPr>
-        <w:t xml:space="preserve"> command of SQL Server, including design and optimization of stored procedures using various JOINS strategies, Views, and triggers. Strong problem-solving ability combined with excellent organizational, written, and verbal communication </w:t>
       </w:r>
       <w:r>
         <w:rPr>
@@ -601,7 +954,6 @@
           <w:szCs w:val="19"/>
           <w:lang w:val="en-US"/>
         </w:rPr>
-        <w:t>skills.</w:t>
       </w:r>
       <w:r>
         <w:rPr>
@@ -618,47 +970,42 @@
           <w:szCs w:val="19"/>
           <w:lang w:val="en-US"/>
         </w:rPr>
-        <w:t xml:space="preserve"> </w:t>
-      </w:r>
-      <w:r>
-        <w:rPr>
-          <w:rFonts w:ascii="Calibri" w:hAnsi="Calibri" w:eastAsia="Calibri" w:cs="Calibri"/>
-          <w:color w:val="000000"/>
-          <w:sz w:val="19"/>
-          <w:szCs w:val="19"/>
-          <w:lang w:val="en-US"/>
-        </w:rPr>
-        <w:t>Proven</w:t>
-      </w:r>
-      <w:r>
-        <w:rPr>
-          <w:rFonts w:ascii="Calibri" w:hAnsi="Calibri" w:eastAsia="Calibri" w:cs="Calibri"/>
-          <w:color w:val="000000"/>
-          <w:sz w:val="19"/>
-          <w:szCs w:val="19"/>
-          <w:lang w:val="en-US"/>
-        </w:rPr>
-        <w:t xml:space="preserve"> delivery </w:t>
-      </w:r>
-      <w:r>
-        <w:rPr>
-          <w:rFonts w:ascii="Calibri" w:hAnsi="Calibri" w:eastAsia="Calibri" w:cs="Calibri"/>
-          <w:color w:val="000000"/>
-          <w:sz w:val="19"/>
-          <w:szCs w:val="19"/>
-          <w:lang w:val="en-US"/>
-        </w:rPr>
-        <w:t>records</w:t>
-      </w:r>
-      <w:r>
-        <w:rPr>
-          <w:rFonts w:ascii="Calibri" w:hAnsi="Calibri" w:eastAsia="Calibri" w:cs="Calibri"/>
-          <w:color w:val="000000"/>
-          <w:sz w:val="19"/>
-          <w:szCs w:val="19"/>
-          <w:lang w:val="en-US"/>
-        </w:rPr>
-        <w:t xml:space="preserve"> across USA and UK spanning BFSI, Insurance, Utilities, Travel, and Healthcare domains.</w:t>
+      </w:r>
+      <w:r>
+        <w:rPr>
+          <w:rFonts w:ascii="Calibri" w:hAnsi="Calibri" w:eastAsia="Calibri" w:cs="Calibri"/>
+          <w:color w:val="000000"/>
+          <w:sz w:val="19"/>
+          <w:szCs w:val="19"/>
+          <w:lang w:val="en-US"/>
+        </w:rPr>
+      </w:r>
+      <w:r>
+        <w:rPr>
+          <w:rFonts w:ascii="Calibri" w:hAnsi="Calibri" w:eastAsia="Calibri" w:cs="Calibri"/>
+          <w:color w:val="000000"/>
+          <w:sz w:val="19"/>
+          <w:szCs w:val="19"/>
+          <w:lang w:val="en-US"/>
+        </w:rPr>
+      </w:r>
+      <w:r>
+        <w:rPr>
+          <w:rFonts w:ascii="Calibri" w:hAnsi="Calibri" w:eastAsia="Calibri" w:cs="Calibri"/>
+          <w:color w:val="000000"/>
+          <w:sz w:val="19"/>
+          <w:szCs w:val="19"/>
+          <w:lang w:val="en-US"/>
+        </w:rPr>
+      </w:r>
+      <w:r>
+        <w:rPr>
+          <w:rFonts w:ascii="Calibri" w:hAnsi="Calibri" w:eastAsia="Calibri" w:cs="Calibri"/>
+          <w:color w:val="000000"/>
+          <w:sz w:val="19"/>
+          <w:szCs w:val="19"/>
+          <w:lang w:val="en-US"/>
+        </w:rPr>
       </w:r>
     </w:p>
     <w:p>
@@ -701,7 +1048,7 @@
         <w:gridCol w:w="2805"/>
         <w:gridCol w:w="4725"/>
       </w:tblGrid>
-      <w:tr>
+      <w:tr xmlns:wp14="http://schemas.microsoft.com/office/word/2010/wordml" wp14:textId="77777777">
         <w:trPr>
           <w:trHeight w:val="300"/>
         </w:trPr>
@@ -881,6 +1228,34 @@
               </w:rPr>
               <w:t>AI-103: Microsoft Certified: Azure AI Apps and Agents Developer Associate</w:t>
             </w:r>
+          </w:p>
+        </w:tc>
+      </w:tr>
+      <w:tr xmlns:wp14="http://schemas.microsoft.com/office/word/2010/wordml" wp14:textId="77777777">
+        <w:tc>
+          <w:tcPr>
+            <w:tcW w:w="2820" w:type="dxa"/>
+          </w:tcPr>
+          <w:p wp14:textId="77777777">
+            <w:r>
+              <w:t>TOGAF Standard 9.2 Certified</w:t>
+            </w:r>
+          </w:p>
+        </w:tc>
+        <w:tc>
+          <w:tcPr>
+            <w:tcW w:w="2805" w:type="dxa"/>
+          </w:tcPr>
+          <w:p wp14:textId="77777777">
+            <w:r/>
+          </w:p>
+        </w:tc>
+        <w:tc>
+          <w:tcPr>
+            <w:tcW w:w="4725" w:type="dxa"/>
+          </w:tcPr>
+          <w:p wp14:textId="77777777">
+            <w:r/>
           </w:p>
         </w:tc>
       </w:tr>
@@ -958,15 +1333,18 @@
               <w:right w:w="0" w:type="dxa"/>
             </w:tcMar>
           </w:tcPr>
-          <w:p wp14:textId="77777777">
-            <w:r>
-              <w:rPr>
-                <w:rFonts w:ascii="Calibri" w:hAnsi="Calibri" w:eastAsia="Calibri" w:cs="Calibri"/>
-                <w:color w:val="000000"/>
-                <w:sz w:val="18"/>
-                <w:szCs w:val="18"/>
-              </w:rPr>
-              <w:t xml:space="preserve">C#, Python, JavaScript, HTML5, Vue 2, Angular, ReactJS, VB.NET</w:t>
+          <w:p wp14:textId="60E8FBF0">
+            <w:r>
+              <w:rPr>
+                <w:lang w:val="en-US"/>
+              </w:rPr>
+              <w:t>C#, Python, JavaScript (ES6+), HTML5, CSS, jQuery, React, Vue 2, Angular, VB.NET, UML</w:t>
+            </w:r>
+            <w:r>
+              <w:rPr>
+                <w:lang w:val="en-US"/>
+              </w:rPr>
+              <w:t xml:space="preserve"> etc</w:t>
             </w:r>
           </w:p>
         </w:tc>
@@ -1029,16 +1407,48 @@
               <w:right w:w="0" w:type="dxa"/>
             </w:tcMar>
           </w:tcPr>
-          <w:p wp14:textId="77777777">
-            <w:r>
-              <w:rPr>
-                <w:rFonts w:ascii="Calibri" w:hAnsi="Calibri" w:eastAsia="Calibri" w:cs="Calibri"/>
-                <w:color w:val="000000"/>
-                <w:sz w:val="18"/>
-                <w:szCs w:val="18"/>
+          <w:p wp14:textId="787FFF0F">
+            <w:r>
+              <w:rPr>
                 <w:lang w:val="en-US"/>
               </w:rPr>
-              <w:t>Azure AI Foundry, Semantic Kernel, LangChain, Claude Code, Cursor IDE, GitHub Copilot, MCP Server, Agents.md, RAG, Prompt Engineering, LLM Integration</w:t>
+              <w:t>GitHub Copilot, Azure AI Foundry, Azure OpenAI,</w:t>
+            </w:r>
+            <w:r>
+              <w:rPr>
+                <w:lang w:val="en-US"/>
+              </w:rPr>
+              <w:t xml:space="preserve"> Amazon Bedrock,</w:t>
+            </w:r>
+            <w:r>
+              <w:rPr>
+                <w:lang w:val="en-US"/>
+              </w:rPr>
+              <w:t xml:space="preserve"> </w:t>
+            </w:r>
+            <w:r>
+              <w:rPr>
+                <w:lang w:val="en-US"/>
+              </w:rPr>
+              <w:t xml:space="preserve"> </w:t>
+            </w:r>
+            <w:r>
+              <w:rPr>
+                <w:lang w:val="en-US"/>
+              </w:rPr>
+              <w:t xml:space="preserve">Semantic Kernel, </w:t>
+            </w:r>
+            <w:r>
+              <w:rPr>
+                <w:lang w:val="en-US"/>
+              </w:rPr>
+              <w:t>LangChain</w:t>
+            </w:r>
+            <w:r>
+              <w:rPr>
+                <w:lang w:val="en-US"/>
+              </w:rPr>
+              <w:t>, Claude Code, Cursor IDE, MCP Server, Agents.md, RAG, Prompt Engineering, Azure Cognitive Services, LLM Integration</w:t>
             </w:r>
           </w:p>
         </w:tc>
@@ -1080,16 +1490,90 @@
               <w:right w:w="0" w:type="dxa"/>
             </w:tcMar>
           </w:tcPr>
-          <w:p wp14:textId="77777777">
-            <w:r>
-              <w:rPr>
-                <w:rFonts w:ascii="Calibri" w:hAnsi="Calibri" w:eastAsia="Calibri" w:cs="Calibri"/>
-                <w:color w:val="000000"/>
-                <w:sz w:val="18"/>
-                <w:szCs w:val="18"/>
+          <w:p wp14:textId="194997CD">
+            <w:r>
+              <w:rPr>
                 <w:lang w:val="en-US"/>
               </w:rPr>
-              <w:t>ASP.NET Core, .NET Core Web API, ASP.NET MVC, Entity Framework Core, WCF, CQRS, MediatR, AutoMapper, xUnit, NUnit, Moq</w:t>
+              <w:t xml:space="preserve">ASP.NET, ASP.NET MVC, ASP.NET Core, .NET Core / .NET Framework, Web API, Entity Framework Core, </w:t>
+            </w:r>
+            <w:r>
+              <w:rPr>
+                <w:lang w:val="en-US"/>
+              </w:rPr>
+              <w:t>WPF,</w:t>
+            </w:r>
+            <w:r>
+              <w:rPr>
+                <w:lang w:val="en-US"/>
+              </w:rPr>
+              <w:t xml:space="preserve"> </w:t>
+            </w:r>
+            <w:r>
+              <w:rPr>
+                <w:lang w:val="en-US"/>
+              </w:rPr>
+              <w:t>WCF</w:t>
+            </w:r>
+            <w:r>
+              <w:rPr>
+                <w:lang w:val="en-US"/>
+              </w:rPr>
+              <w:t xml:space="preserve">, CQRS, </w:t>
+            </w:r>
+            <w:r>
+              <w:rPr>
+                <w:lang w:val="en-US"/>
+              </w:rPr>
+              <w:t>MediatR</w:t>
+            </w:r>
+            <w:r>
+              <w:rPr>
+                <w:lang w:val="en-US"/>
+              </w:rPr>
+              <w:t xml:space="preserve">, </w:t>
+            </w:r>
+            <w:r>
+              <w:rPr>
+                <w:lang w:val="en-US"/>
+              </w:rPr>
+              <w:t>AutoMapper</w:t>
+            </w:r>
+            <w:r>
+              <w:rPr>
+                <w:lang w:val="en-US"/>
+              </w:rPr>
+              <w:t xml:space="preserve">, Bootstrap, </w:t>
+            </w:r>
+            <w:r>
+              <w:rPr>
+                <w:lang w:val="en-US"/>
+              </w:rPr>
+              <w:t>xUnit</w:t>
+            </w:r>
+            <w:r>
+              <w:rPr>
+                <w:lang w:val="en-US"/>
+              </w:rPr>
+              <w:t xml:space="preserve">, </w:t>
+            </w:r>
+            <w:r>
+              <w:rPr>
+                <w:lang w:val="en-US"/>
+              </w:rPr>
+              <w:t>NUnit</w:t>
+            </w:r>
+            <w:r>
+              <w:rPr>
+                <w:lang w:val="en-US"/>
+              </w:rPr>
+              <w:t xml:space="preserve">, </w:t>
+            </w:r>
+            <w:r>
+              <w:rPr>
+                <w:lang w:val="en-US"/>
+              </w:rPr>
+              <w:t>Moq</w:t>
             </w:r>
           </w:p>
         </w:tc>
@@ -1139,7 +1623,7 @@
                 <w:sz w:val="18"/>
                 <w:szCs w:val="18"/>
               </w:rPr>
-              <w:t xml:space="preserve">Microservices, Domain-Driven Design (DDD), Clean Architecture, CQRS/SAGA, REST/SOA, SOLID, Repository Pattern, Dependency Injection</w:t>
+              <w:t>Microservices, Domain-Driven Design (DDD), Clean Architecture, CQRS/SAGA, REST/SOA, SOLID, OOAD/UML, Repository Pattern, Dependency Injection, Solution Architecture (TOGAF)</w:t>
             </w:r>
           </w:p>
         </w:tc>
@@ -1181,16 +1665,36 @@
               <w:right w:w="0" w:type="dxa"/>
             </w:tcMar>
           </w:tcPr>
-          <w:p wp14:textId="77777777">
-            <w:r>
-              <w:rPr>
-                <w:rFonts w:ascii="Calibri" w:hAnsi="Calibri" w:eastAsia="Calibri" w:cs="Calibri"/>
-                <w:color w:val="000000"/>
-                <w:sz w:val="18"/>
-                <w:szCs w:val="18"/>
+          <w:p wp14:textId="22529249">
+            <w:r>
+              <w:rPr>
                 <w:lang w:val="en-US"/>
               </w:rPr>
-              <w:t>Azure (App Services, Functions, Blob Storage, AI Search), Docker, Kubernetes, Azure DevOps, Git, DataDog, IIS</w:t>
+              <w:t xml:space="preserve">AWS, Azure (App Services, Functions, Blob Storage, AI Search, Key Vault), Docker, Kubernetes, Bitbucket, Azure DevOps, Git, TFS, SVN, CI/CD, </w:t>
+            </w:r>
+            <w:r>
+              <w:rPr>
+                <w:lang w:val="en-US"/>
+              </w:rPr>
+              <w:t xml:space="preserve">ELK/Elastic Search, Kibana, </w:t>
+            </w:r>
+            <w:r>
+              <w:rPr>
+                <w:lang w:val="en-US"/>
+              </w:rPr>
+              <w:t xml:space="preserve">Splunk, </w:t>
+            </w:r>
+            <w:r>
+              <w:rPr>
+                <w:lang w:val="en-US"/>
+              </w:rPr>
+              <w:t>DataDog</w:t>
+            </w:r>
+            <w:r>
+              <w:rPr>
+                <w:lang w:val="en-US"/>
+              </w:rPr>
+              <w:t>, IIS</w:t>
             </w:r>
           </w:p>
         </w:tc>
@@ -1232,15 +1736,33 @@
               <w:right w:w="0" w:type="dxa"/>
             </w:tcMar>
           </w:tcPr>
-          <w:p wp14:textId="77777777">
-            <w:r>
-              <w:rPr>
-                <w:rFonts w:ascii="Calibri" w:hAnsi="Calibri" w:eastAsia="Calibri" w:cs="Calibri"/>
-                <w:color w:val="000000"/>
-                <w:sz w:val="18"/>
-                <w:szCs w:val="18"/>
-              </w:rPr>
-              <w:t xml:space="preserve">SQL Server 2016/2014, T-SQL, PostgreSQL, Oracle, SSIS, SSRS</w:t>
+          <w:p wp14:textId="007A3154">
+            <w:pPr>
+              <w:pStyle w:val="Normal"/>
+            </w:pPr>
+            <w:r>
+              <w:rPr>
+                <w:lang w:val="en-GB"/>
+              </w:rPr>
+              <w:t xml:space="preserve"> SQL Server 2016/2014, T-SQL, PostgreSQL, </w:t>
+            </w:r>
+            <w:r>
+              <w:rPr>
+                <w:lang w:val="en-GB"/>
+              </w:rPr>
+              <w:t>Oracle,</w:t>
+            </w:r>
+            <w:r>
+              <w:rPr>
+                <w:lang w:val="en-GB"/>
+              </w:rPr>
+              <w:t xml:space="preserve"> MongoDb,</w:t>
+            </w:r>
+            <w:r>
+              <w:rPr>
+                <w:lang w:val="en-GB"/>
+              </w:rPr>
+              <w:t>NoSQL, SSIS, SSRS, Crystal Reports, Triggers &amp; Stored Procedures</w:t>
             </w:r>
           </w:p>
         </w:tc>
@@ -1282,21 +1804,36 @@
               <w:right w:w="0" w:type="dxa"/>
             </w:tcMar>
           </w:tcPr>
-          <w:p wp14:textId="77777777">
-            <w:r>
-              <w:rPr>
-                <w:rFonts w:ascii="Calibri" w:hAnsi="Calibri" w:eastAsia="Calibri" w:cs="Calibri"/>
-                <w:color w:val="000000"/>
-                <w:sz w:val="18"/>
-                <w:szCs w:val="18"/>
-              </w:rPr>
-              <w:t xml:space="preserve">OWASP Top 10, PCI Compliance, PGP Encryption, Mutual Auth, OAuth 2.0</w:t>
+          <w:p wp14:textId="1E649865">
+            <w:r>
+              <w:rPr>
+                <w:lang w:val="en-US"/>
+              </w:rPr>
+              <w:t xml:space="preserve">OWASP Top 10, Web Security, PCI Compliance, PGP Encryption, Mutual Auth, OAuth 2.0, Azure Key </w:t>
+            </w:r>
+            <w:r>
+              <w:rPr>
+                <w:lang w:val="en-US"/>
+              </w:rPr>
+              <w:t>Vault, Certificate</w:t>
+            </w:r>
+            <w:r>
+              <w:rPr>
+                <w:lang w:val="en-US"/>
+              </w:rPr>
+              <w:t xml:space="preserve"> Management</w:t>
+            </w:r>
+            <w:r>
+              <w:rPr>
+                <w:lang w:val="en-US"/>
+              </w:rPr>
+              <w:t>, Postman. Bruno</w:t>
             </w:r>
           </w:p>
         </w:tc>
       </w:tr>
     </w:tbl>
-    <w:p xmlns:wp14="http://schemas.microsoft.com/office/word/2010/wordml" wp14:textId="77777777">
+    <w:p>
       <w:pPr>
         <w:pBdr>
           <w:bottom w:val="single" w:color="000000" w:sz="6" w:space="2"/>
@@ -1306,16 +1843,549 @@
       <w:r>
         <w:rPr>
           <w:rFonts w:ascii="Calibri" w:hAnsi="Calibri" w:eastAsia="Calibri" w:cs="Calibri"/>
-          <w:b/>
-          <w:bCs/>
+          <w:b w:val="1"/>
+          <w:bCs w:val="1"/>
           <w:color w:val="000000"/>
           <w:sz w:val="22"/>
           <w:szCs w:val="22"/>
         </w:rPr>
-        <w:t xml:space="preserve">PROFESSIONAL EXPERIENCE</w:t>
-      </w:r>
-    </w:p>
-    <w:p xmlns:wp14="http://schemas.microsoft.com/office/word/2010/wordml" wp14:textId="3A1FE896">
+        <w:t>PROFESSIONAL EXPERIENCE</w:t>
+      </w:r>
+    </w:p>
+    <w:p>
+      <w:pPr>
+        <w:pBdr>
+          <w:bottom w:val="single" w:color="000000" w:sz="6" w:space="2"/>
+        </w:pBdr>
+        <w:spacing w:before="160" w:after="60"/>
+      </w:pPr>
+      <w:r>
+        <w:rPr>
+          <w:rFonts w:ascii="Calibri" w:hAnsi="Calibri" w:eastAsia="Calibri" w:cs="Calibri"/>
+          <w:b w:val="1"/>
+          <w:bCs w:val="1"/>
+          <w:color w:val="000000"/>
+          <w:sz w:val="22"/>
+          <w:szCs w:val="22"/>
+          <w:lang w:val="en-US"/>
+        </w:rPr>
+        <w:t>Iris Software (Client: ADP), Pasadena, California</w:t>
+      </w:r>
+      <w:r>
+        <w:tab/>
+      </w:r>
+      <w:r>
+        <w:tab/>
+      </w:r>
+      <w:r>
+        <w:tab/>
+      </w:r>
+      <w:r>
+        <w:tab/>
+      </w:r>
+      <w:r>
+        <w:tab/>
+      </w:r>
+      <w:r>
+        <w:rPr>
+          <w:rFonts w:ascii="Calibri" w:hAnsi="Calibri" w:eastAsia="Calibri" w:cs="Calibri"/>
+          <w:b w:val="1"/>
+          <w:bCs w:val="1"/>
+          <w:color w:val="000000"/>
+          <w:sz w:val="22"/>
+          <w:szCs w:val="22"/>
+          <w:lang w:val="en-US"/>
+        </w:rPr>
+        <w:t>Aug 2026 – Present</w:t>
+      </w:r>
+    </w:p>
+    <w:p>
+      <w:pPr>
+        <w:pBdr>
+          <w:bottom w:val="single" w:color="000000" w:sz="6" w:space="2"/>
+        </w:pBdr>
+        <w:spacing w:before="160" w:after="60"/>
+      </w:pPr>
+      <w:r>
+        <w:rPr>
+          <w:rFonts w:ascii="Calibri" w:hAnsi="Calibri" w:eastAsia="Calibri" w:cs="Calibri"/>
+          <w:b w:val="0"/>
+          <w:bCs w:val="0"/>
+          <w:color w:val="000000"/>
+          <w:sz w:val="22"/>
+          <w:szCs w:val="22"/>
+          <w:lang w:val="en-US"/>
+        </w:rPr>
+        <w:t>Senior .NET Full Stack &amp; AI-Augmented Developer</w:t>
+      </w:r>
+      <w:r>
+        <w:rPr>
+          <w:rFonts w:ascii="Calibri" w:hAnsi="Calibri" w:eastAsia="Calibri" w:cs="Calibri"/>
+          <w:b w:val="0"/>
+          <w:bCs w:val="0"/>
+          <w:color w:val="000000"/>
+          <w:sz w:val="22"/>
+          <w:szCs w:val="22"/>
+          <w:lang w:val="en-US"/>
+        </w:rPr>
+        <w:t xml:space="preserve"> </w:t>
+      </w:r>
+      <w:r>
+        <w:rPr>
+          <w:rFonts w:ascii="Calibri" w:hAnsi="Calibri" w:eastAsia="Calibri" w:cs="Calibri"/>
+          <w:b w:val="0"/>
+          <w:bCs w:val="0"/>
+          <w:color w:val="000000"/>
+          <w:sz w:val="22"/>
+          <w:szCs w:val="22"/>
+          <w:lang w:val="en-US"/>
+        </w:rPr>
+        <w:t>|  Domain</w:t>
+      </w:r>
+      <w:r>
+        <w:rPr>
+          <w:rFonts w:ascii="Calibri" w:hAnsi="Calibri" w:eastAsia="Calibri" w:cs="Calibri"/>
+          <w:b w:val="0"/>
+          <w:bCs w:val="0"/>
+          <w:color w:val="000000"/>
+          <w:sz w:val="22"/>
+          <w:szCs w:val="22"/>
+          <w:lang w:val="en-US"/>
+        </w:rPr>
+        <w:t>: Enterprise HR / Payroll Technology</w:t>
+      </w:r>
+    </w:p>
+    <w:p>
+      <w:pPr>
+        <w:pStyle w:val="ListParagraph"/>
+        <w:numPr>
+          <w:ilvl w:val="0"/>
+          <w:numId w:val="2"/>
+        </w:numPr>
+        <w:spacing w:before="20" w:after="20"/>
+        <w:rPr/>
+      </w:pPr>
+      <w:r>
+        <w:rPr>
+          <w:rFonts w:ascii="Calibri" w:hAnsi="Calibri" w:eastAsia="Calibri" w:cs="Calibri"/>
+          <w:color w:val="000000"/>
+          <w:sz w:val="19"/>
+          <w:szCs w:val="19"/>
+          <w:lang w:val="en-US"/>
+        </w:rPr>
+        <w:t>Working on Time Processor application within ADP’s TLM POD architecture, processing time/punch workflows between TLM Web Application and downstream batch processors.</w:t>
+      </w:r>
+    </w:p>
+    <w:p>
+      <w:pPr>
+        <w:pStyle w:val="ListParagraph"/>
+        <w:numPr>
+          <w:ilvl w:val="0"/>
+          <w:numId w:val="2"/>
+        </w:numPr>
+        <w:spacing w:before="20" w:after="20"/>
+        <w:rPr/>
+      </w:pPr>
+      <w:r>
+        <w:rPr>
+          <w:rFonts w:ascii="Calibri" w:hAnsi="Calibri" w:eastAsia="Calibri" w:cs="Calibri"/>
+          <w:color w:val="000000"/>
+          <w:sz w:val="19"/>
+          <w:szCs w:val="19"/>
+          <w:lang w:val="en-US"/>
+        </w:rPr>
+        <w:t>Working as a Senior .NET Developer developing and supporting backend services using C#, ASP.NET MVC / .NET, and REST APIs on ADP enterprise platforms.</w:t>
+      </w:r>
+    </w:p>
+    <w:p>
+      <w:pPr>
+        <w:pStyle w:val="ListParagraph"/>
+        <w:numPr>
+          <w:ilvl w:val="0"/>
+          <w:numId w:val="2"/>
+        </w:numPr>
+        <w:spacing w:before="20" w:after="20"/>
+        <w:rPr>
+          <w:rFonts w:ascii="Calibri" w:hAnsi="Calibri" w:eastAsia="Calibri" w:cs="Calibri"/>
+          <w:color w:val="000000"/>
+          <w:sz w:val="19"/>
+          <w:szCs w:val="19"/>
+          <w:lang w:val="en-US"/>
+        </w:rPr>
+      </w:pPr>
+      <w:r>
+        <w:rPr>
+          <w:rFonts w:ascii="Calibri" w:hAnsi="Calibri" w:eastAsia="Calibri" w:cs="Calibri"/>
+          <w:color w:val="000000"/>
+          <w:sz w:val="19"/>
+          <w:szCs w:val="19"/>
+          <w:lang w:val="en-US"/>
+        </w:rPr>
+        <w:t xml:space="preserve">Using </w:t>
+      </w:r>
+      <w:r>
+        <w:rPr>
+          <w:rFonts w:ascii="Calibri" w:hAnsi="Calibri" w:eastAsia="Calibri" w:cs="Calibri"/>
+          <w:color w:val="000000"/>
+          <w:sz w:val="19"/>
+          <w:szCs w:val="19"/>
+          <w:lang w:val="en-US"/>
+        </w:rPr>
+        <w:t>G</w:t>
+      </w:r>
+      <w:r>
+        <w:rPr>
+          <w:rFonts w:ascii="Calibri" w:hAnsi="Calibri" w:eastAsia="Calibri" w:cs="Calibri"/>
+          <w:color w:val="000000"/>
+          <w:sz w:val="19"/>
+          <w:szCs w:val="19"/>
+          <w:lang w:val="en-US"/>
+        </w:rPr>
+        <w:t>i</w:t>
+      </w:r>
+      <w:r>
+        <w:rPr>
+          <w:rFonts w:ascii="Calibri" w:hAnsi="Calibri" w:eastAsia="Calibri" w:cs="Calibri"/>
+          <w:color w:val="000000"/>
+          <w:sz w:val="19"/>
+          <w:szCs w:val="19"/>
+          <w:lang w:val="en-US"/>
+        </w:rPr>
+        <w:t>thub</w:t>
+      </w:r>
+      <w:r>
+        <w:rPr>
+          <w:rFonts w:ascii="Calibri" w:hAnsi="Calibri" w:eastAsia="Calibri" w:cs="Calibri"/>
+          <w:color w:val="000000"/>
+          <w:sz w:val="19"/>
+          <w:szCs w:val="19"/>
+          <w:lang w:val="en-US"/>
+        </w:rPr>
+        <w:t xml:space="preserve"> Copilot/Amazon Q</w:t>
+      </w:r>
+      <w:r>
+        <w:rPr>
+          <w:rFonts w:ascii="Calibri" w:hAnsi="Calibri" w:eastAsia="Calibri" w:cs="Calibri"/>
+          <w:color w:val="000000"/>
+          <w:sz w:val="19"/>
+          <w:szCs w:val="19"/>
+          <w:lang w:val="en-US"/>
+        </w:rPr>
+        <w:t xml:space="preserve"> with VS Code for AI-assisted development; Bitbucket for source control; Oracle DB and AWS in the ADP environment.</w:t>
+      </w:r>
+    </w:p>
+    <w:p>
+      <w:pPr>
+        <w:pStyle w:val="ListParagraph"/>
+        <w:numPr>
+          <w:ilvl w:val="0"/>
+          <w:numId w:val="2"/>
+        </w:numPr>
+        <w:spacing w:before="20" w:after="20"/>
+        <w:rPr>
+          <w:rFonts w:ascii="Calibri" w:hAnsi="Calibri" w:eastAsia="Calibri" w:cs="Calibri"/>
+          <w:color w:val="000000"/>
+          <w:sz w:val="19"/>
+          <w:szCs w:val="19"/>
+          <w:lang w:val="en-US"/>
+        </w:rPr>
+      </w:pPr>
+      <w:r>
+        <w:rPr>
+          <w:rFonts w:ascii="Calibri" w:hAnsi="Calibri" w:eastAsia="Calibri" w:cs="Calibri"/>
+          <w:color w:val="000000"/>
+          <w:sz w:val="19"/>
+          <w:szCs w:val="19"/>
+          <w:lang w:val="en-US"/>
+        </w:rPr>
+        <w:t xml:space="preserve">Framework upgrade of existing applications to latest </w:t>
+      </w:r>
+      <w:r>
+        <w:rPr>
+          <w:rFonts w:ascii="Calibri" w:hAnsi="Calibri" w:eastAsia="Calibri" w:cs="Calibri"/>
+          <w:color w:val="000000"/>
+          <w:sz w:val="19"/>
+          <w:szCs w:val="19"/>
+          <w:lang w:val="en-US"/>
+        </w:rPr>
+        <w:t>.Net</w:t>
+      </w:r>
+      <w:r>
+        <w:rPr>
+          <w:rFonts w:ascii="Calibri" w:hAnsi="Calibri" w:eastAsia="Calibri" w:cs="Calibri"/>
+          <w:color w:val="000000"/>
+          <w:sz w:val="19"/>
+          <w:szCs w:val="19"/>
+          <w:lang w:val="en-US"/>
+        </w:rPr>
+        <w:t xml:space="preserve"> framework.</w:t>
+      </w:r>
+    </w:p>
+    <w:p>
+      <w:pPr>
+        <w:pStyle w:val="ListParagraph"/>
+        <w:numPr>
+          <w:ilvl w:val="0"/>
+          <w:numId w:val="2"/>
+        </w:numPr>
+        <w:spacing w:before="20" w:after="20"/>
+        <w:rPr>
+          <w:rFonts w:ascii="Calibri" w:hAnsi="Calibri" w:eastAsia="Calibri" w:cs="Calibri"/>
+          <w:color w:val="000000"/>
+          <w:sz w:val="19"/>
+          <w:szCs w:val="19"/>
+          <w:lang w:val="en-US"/>
+        </w:rPr>
+      </w:pPr>
+      <w:r>
+        <w:rPr>
+          <w:rFonts w:ascii="Calibri" w:hAnsi="Calibri" w:eastAsia="Calibri" w:cs="Calibri"/>
+          <w:color w:val="000000"/>
+          <w:sz w:val="19"/>
+          <w:szCs w:val="19"/>
+          <w:lang w:val="en-US"/>
+        </w:rPr>
+        <w:t xml:space="preserve">requirement gathering and solution design for complex enhancement </w:t>
+      </w:r>
+      <w:r>
+        <w:rPr>
+          <w:rFonts w:ascii="Calibri" w:hAnsi="Calibri" w:eastAsia="Calibri" w:cs="Calibri"/>
+          <w:color w:val="000000"/>
+          <w:sz w:val="19"/>
+          <w:szCs w:val="19"/>
+          <w:lang w:val="en-US"/>
+        </w:rPr>
+        <w:t>of</w:t>
+      </w:r>
+      <w:r>
+        <w:rPr>
+          <w:rFonts w:ascii="Calibri" w:hAnsi="Calibri" w:eastAsia="Calibri" w:cs="Calibri"/>
+          <w:color w:val="000000"/>
+          <w:sz w:val="19"/>
+          <w:szCs w:val="19"/>
+          <w:lang w:val="en-US"/>
+        </w:rPr>
+        <w:t xml:space="preserve"> the Time processor </w:t>
+      </w:r>
+      <w:r>
+        <w:rPr>
+          <w:rFonts w:ascii="Calibri" w:hAnsi="Calibri" w:eastAsia="Calibri" w:cs="Calibri"/>
+          <w:color w:val="000000"/>
+          <w:sz w:val="19"/>
+          <w:szCs w:val="19"/>
+          <w:lang w:val="en-US"/>
+        </w:rPr>
+        <w:t>applications</w:t>
+      </w:r>
+      <w:r>
+        <w:rPr>
+          <w:rFonts w:ascii="Calibri" w:hAnsi="Calibri" w:eastAsia="Calibri" w:cs="Calibri"/>
+          <w:color w:val="000000"/>
+          <w:sz w:val="19"/>
+          <w:szCs w:val="19"/>
+          <w:lang w:val="en-US"/>
+        </w:rPr>
+        <w:t>.</w:t>
+      </w:r>
+    </w:p>
+    <w:p>
+      <w:pPr>
+        <w:pStyle w:val="ListParagraph"/>
+        <w:numPr>
+          <w:ilvl w:val="0"/>
+          <w:numId w:val="2"/>
+        </w:numPr>
+        <w:spacing w:before="20" w:after="20"/>
+        <w:rPr>
+          <w:rFonts w:ascii="Calibri" w:hAnsi="Calibri" w:eastAsia="Calibri" w:cs="Calibri"/>
+          <w:color w:val="000000"/>
+          <w:sz w:val="19"/>
+          <w:szCs w:val="19"/>
+          <w:lang w:val="en-US"/>
+        </w:rPr>
+      </w:pPr>
+      <w:r>
+        <w:rPr>
+          <w:rFonts w:ascii="Calibri" w:hAnsi="Calibri" w:eastAsia="Calibri" w:cs="Calibri"/>
+          <w:color w:val="000000"/>
+          <w:sz w:val="19"/>
+          <w:szCs w:val="19"/>
+          <w:lang w:val="en-US"/>
+        </w:rPr>
+        <w:t xml:space="preserve">Involved all </w:t>
+      </w:r>
+      <w:r>
+        <w:rPr>
+          <w:rFonts w:ascii="Calibri" w:hAnsi="Calibri" w:eastAsia="Calibri" w:cs="Calibri"/>
+          <w:color w:val="000000"/>
+          <w:sz w:val="19"/>
+          <w:szCs w:val="19"/>
+          <w:lang w:val="en-US"/>
+        </w:rPr>
+        <w:t>phases</w:t>
+      </w:r>
+      <w:r>
+        <w:rPr>
+          <w:rFonts w:ascii="Calibri" w:hAnsi="Calibri" w:eastAsia="Calibri" w:cs="Calibri"/>
+          <w:color w:val="000000"/>
+          <w:sz w:val="19"/>
+          <w:szCs w:val="19"/>
+          <w:lang w:val="en-US"/>
+        </w:rPr>
+        <w:t xml:space="preserve"> of software development from analysis, design, </w:t>
+      </w:r>
+      <w:r>
+        <w:rPr>
+          <w:rFonts w:ascii="Calibri" w:hAnsi="Calibri" w:eastAsia="Calibri" w:cs="Calibri"/>
+          <w:color w:val="000000"/>
+          <w:sz w:val="19"/>
+          <w:szCs w:val="19"/>
+          <w:lang w:val="en-US"/>
+        </w:rPr>
+        <w:t>coding,</w:t>
+      </w:r>
+      <w:r>
+        <w:rPr>
+          <w:rFonts w:ascii="Calibri" w:hAnsi="Calibri" w:eastAsia="Calibri" w:cs="Calibri"/>
+          <w:color w:val="000000"/>
+          <w:sz w:val="19"/>
+          <w:szCs w:val="19"/>
+          <w:lang w:val="en-US"/>
+        </w:rPr>
+        <w:t xml:space="preserve"> </w:t>
+      </w:r>
+      <w:r>
+        <w:rPr>
+          <w:rFonts w:ascii="Calibri" w:hAnsi="Calibri" w:eastAsia="Calibri" w:cs="Calibri"/>
+          <w:color w:val="000000"/>
+          <w:sz w:val="19"/>
+          <w:szCs w:val="19"/>
+          <w:lang w:val="en-US"/>
+        </w:rPr>
+        <w:t xml:space="preserve">unit testing and release using </w:t>
+      </w:r>
+      <w:r>
+        <w:rPr>
+          <w:rFonts w:ascii="Calibri" w:hAnsi="Calibri" w:eastAsia="Calibri" w:cs="Calibri"/>
+          <w:color w:val="000000"/>
+          <w:sz w:val="19"/>
+          <w:szCs w:val="19"/>
+          <w:lang w:val="en-US"/>
+        </w:rPr>
+        <w:t>CI/CD.</w:t>
+      </w:r>
+    </w:p>
+    <w:p>
+      <w:pPr>
+        <w:spacing w:before="40" w:after="40"/>
+        <w:rPr>
+          <w:rFonts w:ascii="Calibri" w:hAnsi="Calibri" w:eastAsia="Calibri" w:cs="Calibri"/>
+          <w:i w:val="1"/>
+          <w:iCs w:val="1"/>
+          <w:color w:val="000000"/>
+          <w:sz w:val="17"/>
+          <w:szCs w:val="17"/>
+          <w:lang w:val="en-US"/>
+        </w:rPr>
+      </w:pPr>
+      <w:r>
+        <w:rPr>
+          <w:rFonts w:ascii="Calibri" w:hAnsi="Calibri" w:eastAsia="Calibri" w:cs="Calibri"/>
+          <w:i w:val="1"/>
+          <w:iCs w:val="1"/>
+          <w:color w:val="000000"/>
+          <w:sz w:val="17"/>
+          <w:szCs w:val="17"/>
+          <w:lang w:val="en-US"/>
+        </w:rPr>
+        <w:t xml:space="preserve">Environment: C#, .NET Core </w:t>
+      </w:r>
+      <w:r>
+        <w:rPr>
+          <w:rFonts w:ascii="Calibri" w:hAnsi="Calibri" w:eastAsia="Calibri" w:cs="Calibri"/>
+          <w:i w:val="1"/>
+          <w:iCs w:val="1"/>
+          <w:color w:val="000000"/>
+          <w:sz w:val="17"/>
+          <w:szCs w:val="17"/>
+          <w:lang w:val="en-US"/>
+        </w:rPr>
+        <w:t>/ .NET</w:t>
+      </w:r>
+      <w:r>
+        <w:rPr>
+          <w:rFonts w:ascii="Calibri" w:hAnsi="Calibri" w:eastAsia="Calibri" w:cs="Calibri"/>
+          <w:i w:val="1"/>
+          <w:iCs w:val="1"/>
+          <w:color w:val="000000"/>
+          <w:sz w:val="17"/>
+          <w:szCs w:val="17"/>
+          <w:lang w:val="en-US"/>
+        </w:rPr>
+        <w:t xml:space="preserve"> Framework, ASP.NET MVC, REST APIs, Oracle DB, AWS, Bitbucket, Amazon</w:t>
+      </w:r>
+      <w:r>
+        <w:rPr>
+          <w:rFonts w:ascii="Calibri" w:hAnsi="Calibri" w:eastAsia="Calibri" w:cs="Calibri"/>
+          <w:i w:val="1"/>
+          <w:iCs w:val="1"/>
+          <w:color w:val="000000"/>
+          <w:sz w:val="17"/>
+          <w:szCs w:val="17"/>
+          <w:lang w:val="en-US"/>
+        </w:rPr>
+        <w:t xml:space="preserve"> Bedrock, </w:t>
+      </w:r>
+      <w:r>
+        <w:rPr>
+          <w:rFonts w:ascii="Calibri" w:hAnsi="Calibri" w:eastAsia="Calibri" w:cs="Calibri"/>
+          <w:i w:val="1"/>
+          <w:iCs w:val="1"/>
+          <w:color w:val="000000"/>
+          <w:sz w:val="17"/>
+          <w:szCs w:val="17"/>
+          <w:lang w:val="en-US"/>
+        </w:rPr>
+        <w:t>Splunk, Bruno</w:t>
+      </w:r>
+      <w:r>
+        <w:rPr>
+          <w:rFonts w:ascii="Calibri" w:hAnsi="Calibri" w:eastAsia="Calibri" w:cs="Calibri"/>
+          <w:i w:val="1"/>
+          <w:iCs w:val="1"/>
+          <w:color w:val="000000"/>
+          <w:sz w:val="17"/>
+          <w:szCs w:val="17"/>
+          <w:lang w:val="en-US"/>
+        </w:rPr>
+        <w:t xml:space="preserve"> </w:t>
+      </w:r>
+      <w:r>
+        <w:rPr>
+          <w:rFonts w:ascii="Calibri" w:hAnsi="Calibri" w:eastAsia="Calibri" w:cs="Calibri"/>
+          <w:i w:val="1"/>
+          <w:iCs w:val="1"/>
+          <w:color w:val="000000"/>
+          <w:sz w:val="17"/>
+          <w:szCs w:val="17"/>
+          <w:lang w:val="en-US"/>
+        </w:rPr>
+        <w:t xml:space="preserve">, Jenkins </w:t>
+      </w:r>
+      <w:r>
+        <w:rPr>
+          <w:rFonts w:ascii="Calibri" w:hAnsi="Calibri" w:eastAsia="Calibri" w:cs="Calibri"/>
+          <w:i w:val="1"/>
+          <w:iCs w:val="1"/>
+          <w:color w:val="000000"/>
+          <w:sz w:val="17"/>
+          <w:szCs w:val="17"/>
+          <w:lang w:val="en-US"/>
+        </w:rPr>
+        <w:t>etc.</w:t>
+      </w:r>
+    </w:p>
+    <w:p xmlns:wp14="http://schemas.microsoft.com/office/word/2010/wordml" wp14:textId="424042FD">
       <w:pPr>
         <w:pStyle w:val="Normal"/>
         <w:tabs>
@@ -1333,7 +2403,7 @@
           <w:szCs w:val="20"/>
           <w:lang w:val="en-GB"/>
         </w:rPr>
-        <w:t xml:space="preserve">Neilson Technology </w:t>
+        <w:t>Neilson Technology Services, California</w:t>
       </w:r>
       <w:r>
         <w:rPr>
@@ -1345,31 +2415,31 @@
           <w:szCs w:val="20"/>
           <w:lang w:val="en-GB"/>
         </w:rPr>
-        <w:t>Services, California</w:t>
-      </w:r>
-      <w:r>
-        <w:rPr>
-          <w:rFonts w:ascii="Calibri" w:hAnsi="Calibri" w:eastAsia="Calibri" w:cs="Calibri"/>
+      </w:r>
+      <w:r>
+        <w:rPr>
+          <w:rFonts w:ascii="Calibri" w:hAnsi="Calibri" w:eastAsia="Calibri" w:cs="Calibri"/>
+          <w:b w:val="0"/>
           <w:color w:val="000000"/>
           <w:sz w:val="19"/>
           <w:szCs w:val="19"/>
           <w:lang w:val="en-GB"/>
         </w:rPr>
-        <w:t xml:space="preserve">  </w:t>
-      </w:r>
-      <w:r>
         <w:tab/>
       </w:r>
       <w:r>
         <w:rPr>
           <w:rFonts w:ascii="Calibri" w:hAnsi="Calibri" w:eastAsia="Calibri" w:cs="Calibri"/>
+          <w:b w:val="0"/>
+          <w:bCs w:val="0"/>
           <w:color w:val="000000"/>
           <w:sz w:val="19"/>
           <w:szCs w:val="19"/>
           <w:lang w:val="en-GB"/>
         </w:rPr>
-        <w:t xml:space="preserve"> </w:t>
-      </w:r>
+        <w:t>Nov 2021 – June 2026</w:t>
+      </w:r>
+      <w:r/>
       <w:r>
         <w:rPr>
           <w:rFonts w:ascii="Calibri" w:hAnsi="Calibri" w:eastAsia="Calibri" w:cs="Calibri"/>
@@ -1378,7 +2448,6 @@
           <w:szCs w:val="19"/>
           <w:lang w:val="en-GB"/>
         </w:rPr>
-        <w:t>N</w:t>
       </w:r>
       <w:r>
         <w:rPr>
@@ -1388,7 +2457,6 @@
           <w:szCs w:val="19"/>
           <w:lang w:val="en-GB"/>
         </w:rPr>
-        <w:t>ov 2021 – Present</w:t>
       </w:r>
     </w:p>
     <w:p xmlns:wp14="http://schemas.microsoft.com/office/word/2010/wordml" wp14:textId="3A9E2E4A">
@@ -1453,6 +2521,129 @@
           <w:numId w:val="2"/>
         </w:numPr>
         <w:spacing w:before="20" w:after="20"/>
+        <w:rPr>
+          <w:rFonts w:ascii="Calibri" w:hAnsi="Calibri" w:eastAsia="Calibri" w:cs="Calibri"/>
+          <w:color w:val="000000"/>
+          <w:sz w:val="19"/>
+          <w:szCs w:val="19"/>
+          <w:lang w:val="en-US"/>
+        </w:rPr>
+      </w:pPr>
+      <w:r>
+        <w:rPr>
+          <w:rFonts w:ascii="Calibri" w:hAnsi="Calibri" w:eastAsia="Calibri" w:cs="Calibri"/>
+          <w:color w:val="000000"/>
+          <w:sz w:val="19"/>
+          <w:szCs w:val="19"/>
+          <w:lang w:val="en-US"/>
+        </w:rPr>
+        <w:t>Delivered Microservices APIs using C#, .NET Core Web API, CQRS, MediatR, AutoMapper, and Clean DDD Architecture for insurance product lifecycle management.</w:t>
+      </w:r>
+    </w:p>
+    <w:p>
+      <w:pPr>
+        <w:pStyle w:val="ListParagraph"/>
+        <w:numPr>
+          <w:ilvl w:val="0"/>
+          <w:numId w:val="2"/>
+        </w:numPr>
+        <w:spacing w:before="20" w:after="20"/>
+        <w:rPr>
+          <w:rFonts w:ascii="Calibri" w:hAnsi="Calibri" w:eastAsia="Calibri" w:cs="Calibri"/>
+          <w:color w:val="000000"/>
+          <w:sz w:val="19"/>
+          <w:szCs w:val="19"/>
+          <w:lang w:val="en-US"/>
+        </w:rPr>
+      </w:pPr>
+      <w:r>
+        <w:rPr>
+          <w:rFonts w:ascii="Calibri" w:hAnsi="Calibri" w:eastAsia="Calibri" w:cs="Calibri"/>
+          <w:color w:val="000000"/>
+          <w:sz w:val="19"/>
+          <w:szCs w:val="19"/>
+          <w:lang w:val="en-US"/>
+        </w:rPr>
+        <w:t xml:space="preserve">Developed </w:t>
+      </w:r>
+      <w:r>
+        <w:rPr>
+          <w:rFonts w:ascii="Calibri" w:hAnsi="Calibri" w:eastAsia="Calibri" w:cs="Calibri"/>
+          <w:color w:val="000000"/>
+          <w:sz w:val="19"/>
+          <w:szCs w:val="19"/>
+          <w:lang w:val="en-US"/>
+        </w:rPr>
+        <w:t>Mind-map</w:t>
+      </w:r>
+      <w:r>
+        <w:rPr>
+          <w:rFonts w:ascii="Calibri" w:hAnsi="Calibri" w:eastAsia="Calibri" w:cs="Calibri"/>
+          <w:color w:val="000000"/>
+          <w:sz w:val="19"/>
+          <w:szCs w:val="19"/>
+          <w:lang w:val="en-US"/>
+        </w:rPr>
+        <w:t xml:space="preserve"> JSON editor tool to </w:t>
+      </w:r>
+      <w:r>
+        <w:rPr>
+          <w:rFonts w:ascii="Calibri" w:hAnsi="Calibri" w:eastAsia="Calibri" w:cs="Calibri"/>
+          <w:color w:val="000000"/>
+          <w:sz w:val="19"/>
+          <w:szCs w:val="19"/>
+          <w:lang w:val="en-US"/>
+        </w:rPr>
+        <w:t>facilitate</w:t>
+      </w:r>
+      <w:r>
+        <w:rPr>
+          <w:rFonts w:ascii="Calibri" w:hAnsi="Calibri" w:eastAsia="Calibri" w:cs="Calibri"/>
+          <w:color w:val="000000"/>
+          <w:sz w:val="19"/>
+          <w:szCs w:val="19"/>
+          <w:lang w:val="en-US"/>
+        </w:rPr>
+        <w:t xml:space="preserve"> new Product launches</w:t>
+      </w:r>
+      <w:r>
+        <w:rPr>
+          <w:rFonts w:ascii="Calibri" w:hAnsi="Calibri" w:eastAsia="Calibri" w:cs="Calibri"/>
+          <w:color w:val="000000"/>
+          <w:sz w:val="19"/>
+          <w:szCs w:val="19"/>
+          <w:lang w:val="en-US"/>
+        </w:rPr>
+        <w:t>.</w:t>
+      </w:r>
+    </w:p>
+    <w:p xmlns:wp14="http://schemas.microsoft.com/office/word/2010/wordml" wp14:textId="77777777">
+      <w:pPr>
+        <w:pStyle w:val="ListParagraph"/>
+        <w:numPr>
+          <w:ilvl w:val="0"/>
+          <w:numId w:val="2"/>
+        </w:numPr>
+        <w:spacing w:before="20" w:after="20"/>
+      </w:pPr>
+      <w:r>
+        <w:rPr>
+          <w:rFonts w:ascii="Calibri" w:hAnsi="Calibri" w:eastAsia="Calibri" w:cs="Calibri"/>
+          <w:color w:val="000000"/>
+          <w:sz w:val="19"/>
+          <w:szCs w:val="19"/>
+        </w:rPr>
+        <w:t xml:space="preserve">Owned Canada month-end financial processing (Apr 2023 – Apr 2025): T-error resolution, financial reconciliation, and regulatory reporting.</w:t>
+      </w:r>
+    </w:p>
+    <w:p xmlns:wp14="http://schemas.microsoft.com/office/word/2010/wordml" wp14:textId="1FA0C231">
+      <w:pPr>
+        <w:pStyle w:val="ListParagraph"/>
+        <w:numPr>
+          <w:ilvl w:val="0"/>
+          <w:numId w:val="2"/>
+        </w:numPr>
+        <w:spacing w:before="20" w:after="20"/>
         <w:rPr/>
       </w:pPr>
       <w:r>
@@ -1463,7 +2654,121 @@
           <w:szCs w:val="19"/>
           <w:lang w:val="en-US"/>
         </w:rPr>
-        <w:t>Delivered Microservices APIs using C#, .NET Core Web API, CQRS, MediatR, AutoMapper, and Clean DDD Architecture for insurance product lifecycle management.</w:t>
+        <w:t xml:space="preserve">Using WPF </w:t>
+      </w:r>
+      <w:r>
+        <w:rPr>
+          <w:rFonts w:ascii="Calibri" w:hAnsi="Calibri" w:eastAsia="Calibri" w:cs="Calibri"/>
+          <w:color w:val="000000"/>
+          <w:sz w:val="19"/>
+          <w:szCs w:val="19"/>
+          <w:lang w:val="en-US"/>
+        </w:rPr>
+        <w:t>application</w:t>
+      </w:r>
+      <w:r>
+        <w:rPr>
+          <w:rFonts w:ascii="Calibri" w:hAnsi="Calibri" w:eastAsia="Calibri" w:cs="Calibri"/>
+          <w:color w:val="000000"/>
+          <w:sz w:val="19"/>
+          <w:szCs w:val="19"/>
+          <w:lang w:val="en-US"/>
+        </w:rPr>
+        <w:t xml:space="preserve"> engineered automated</w:t>
+      </w:r>
+      <w:r>
+        <w:rPr>
+          <w:rFonts w:ascii="Calibri" w:hAnsi="Calibri" w:eastAsia="Calibri" w:cs="Calibri"/>
+          <w:color w:val="000000"/>
+          <w:sz w:val="19"/>
+          <w:szCs w:val="19"/>
+          <w:lang w:val="en-US"/>
+        </w:rPr>
+        <w:t xml:space="preserve"> generation of policy certificates, welcome packs, customer letters, and endorsements — </w:t>
+      </w:r>
+      <w:r>
+        <w:rPr>
+          <w:rFonts w:ascii="Calibri" w:hAnsi="Calibri" w:eastAsia="Calibri" w:cs="Calibri"/>
+          <w:color w:val="000000"/>
+          <w:sz w:val="19"/>
+          <w:szCs w:val="19"/>
+          <w:lang w:val="en-US"/>
+        </w:rPr>
+        <w:t>eliminating</w:t>
+      </w:r>
+      <w:r>
+        <w:rPr>
+          <w:rFonts w:ascii="Calibri" w:hAnsi="Calibri" w:eastAsia="Calibri" w:cs="Calibri"/>
+          <w:color w:val="000000"/>
+          <w:sz w:val="19"/>
+          <w:szCs w:val="19"/>
+          <w:lang w:val="en-US"/>
+        </w:rPr>
+        <w:t xml:space="preserve"> manual document production.</w:t>
+      </w:r>
+    </w:p>
+    <w:p xmlns:wp14="http://schemas.microsoft.com/office/word/2010/wordml" wp14:textId="5A5B5C59">
+      <w:pPr>
+        <w:pStyle w:val="ListParagraph"/>
+        <w:numPr>
+          <w:ilvl w:val="0"/>
+          <w:numId w:val="2"/>
+        </w:numPr>
+        <w:spacing w:before="20" w:after="20"/>
+        <w:rPr>
+          <w:rFonts w:ascii="Calibri" w:hAnsi="Calibri" w:eastAsia="Calibri" w:cs="Calibri"/>
+          <w:color w:val="000000"/>
+          <w:sz w:val="19"/>
+          <w:szCs w:val="19"/>
+          <w:lang w:val="en-US"/>
+        </w:rPr>
+      </w:pPr>
+      <w:r>
+        <w:rPr>
+          <w:rFonts w:ascii="Calibri" w:hAnsi="Calibri" w:eastAsia="Calibri" w:cs="Calibri"/>
+          <w:color w:val="000000"/>
+          <w:sz w:val="19"/>
+          <w:szCs w:val="19"/>
+          <w:lang w:val="en-US"/>
+        </w:rPr>
+        <w:t>Managed Stripe financial reporting</w:t>
+      </w:r>
+      <w:r>
+        <w:rPr>
+          <w:rFonts w:ascii="Calibri" w:hAnsi="Calibri" w:eastAsia="Calibri" w:cs="Calibri"/>
+          <w:color w:val="000000"/>
+          <w:sz w:val="19"/>
+          <w:szCs w:val="19"/>
+          <w:lang w:val="en-US"/>
+        </w:rPr>
+        <w:t xml:space="preserve"> connected account notifications, and account balance monitoring integrations.</w:t>
+      </w:r>
+    </w:p>
+    <w:p>
+      <w:pPr>
+        <w:pStyle w:val="ListParagraph"/>
+        <w:numPr>
+          <w:ilvl w:val="0"/>
+          <w:numId w:val="2"/>
+        </w:numPr>
+        <w:spacing w:before="20" w:after="20"/>
+        <w:rPr>
+          <w:rFonts w:ascii="Calibri" w:hAnsi="Calibri" w:eastAsia="Calibri" w:cs="Calibri"/>
+          <w:color w:val="000000"/>
+          <w:sz w:val="19"/>
+          <w:szCs w:val="19"/>
+          <w:lang w:val="en-US"/>
+        </w:rPr>
+      </w:pPr>
+      <w:r>
+        <w:rPr>
+          <w:rFonts w:ascii="Calibri" w:hAnsi="Calibri" w:eastAsia="Calibri" w:cs="Calibri"/>
+          <w:color w:val="000000"/>
+          <w:sz w:val="19"/>
+          <w:szCs w:val="19"/>
+          <w:lang w:val="en-US"/>
+        </w:rPr>
+        <w:t>Using Python developed solutions for masking PCI-sensitive data in ELK/Elasticsearch (regex redaction) and for data migration from Elasticsearch to Datadog, including dashboards and alerts.</w:t>
       </w:r>
     </w:p>
     <w:p xmlns:wp14="http://schemas.microsoft.com/office/word/2010/wordml" wp14:textId="77777777">
@@ -1474,15 +2779,17 @@
           <w:numId w:val="2"/>
         </w:numPr>
         <w:spacing w:before="20" w:after="20"/>
-      </w:pPr>
-      <w:r>
-        <w:rPr>
-          <w:rFonts w:ascii="Calibri" w:hAnsi="Calibri" w:eastAsia="Calibri" w:cs="Calibri"/>
-          <w:color w:val="000000"/>
-          <w:sz w:val="19"/>
-          <w:szCs w:val="19"/>
-        </w:rPr>
-        <w:t xml:space="preserve">Owned Canada month-end financial processing (Apr 2023 – Apr 2025): T-error resolution, financial reconciliation, and regulatory reporting.</w:t>
+        <w:rPr/>
+      </w:pPr>
+      <w:r>
+        <w:rPr>
+          <w:rFonts w:ascii="Calibri" w:hAnsi="Calibri" w:eastAsia="Calibri" w:cs="Calibri"/>
+          <w:color w:val="000000"/>
+          <w:sz w:val="19"/>
+          <w:szCs w:val="19"/>
+          <w:lang w:val="en-US"/>
+        </w:rPr>
+        <w:t>Supported major reinsurer and branding transitions (GenRe → Munich Re Canada; AIG Life → Aviva Protection Limited) with zero data-loss migration.</w:t>
       </w:r>
     </w:p>
     <w:p xmlns:wp14="http://schemas.microsoft.com/office/word/2010/wordml" wp14:textId="77777777">
@@ -1493,6 +2800,44 @@
           <w:numId w:val="2"/>
         </w:numPr>
         <w:spacing w:before="20" w:after="20"/>
+      </w:pPr>
+      <w:r>
+        <w:rPr>
+          <w:rFonts w:ascii="Calibri" w:hAnsi="Calibri" w:eastAsia="Calibri" w:cs="Calibri"/>
+          <w:color w:val="000000"/>
+          <w:sz w:val="19"/>
+          <w:szCs w:val="19"/>
+        </w:rPr>
+        <w:t xml:space="preserve">Architected team AI-augmented SDLC end-to-end integrating Claude Code, Cursor IDE, and GitHub Copilot — accelerating sprint velocity and reducing code-review turnaround.</w:t>
+      </w:r>
+    </w:p>
+    <w:p xmlns:wp14="http://schemas.microsoft.com/office/word/2010/wordml" wp14:textId="77777777">
+      <w:pPr>
+        <w:pStyle w:val="ListParagraph"/>
+        <w:numPr>
+          <w:ilvl w:val="0"/>
+          <w:numId w:val="2"/>
+        </w:numPr>
+        <w:spacing w:before="20" w:after="20"/>
+      </w:pPr>
+      <w:r>
+        <w:rPr>
+          <w:rFonts w:ascii="Calibri" w:hAnsi="Calibri" w:eastAsia="Calibri" w:cs="Calibri"/>
+          <w:color w:val="000000"/>
+          <w:sz w:val="19"/>
+          <w:szCs w:val="19"/>
+        </w:rPr>
+        <w:t xml:space="preserve">Built a custom MCP (Model Context Protocol) server that injects repo-specific Agents.md, architecture rules, and coding standards into AI editor sessions.</w:t>
+      </w:r>
+    </w:p>
+    <w:p xmlns:wp14="http://schemas.microsoft.com/office/word/2010/wordml" wp14:textId="77777777">
+      <w:pPr>
+        <w:pStyle w:val="ListParagraph"/>
+        <w:numPr>
+          <w:ilvl w:val="0"/>
+          <w:numId w:val="2"/>
+        </w:numPr>
+        <w:spacing w:before="20" w:after="20"/>
         <w:rPr/>
       </w:pPr>
       <w:r>
@@ -1503,7 +2848,7 @@
           <w:szCs w:val="19"/>
           <w:lang w:val="en-US"/>
         </w:rPr>
-        <w:t>Engineered automated generation of policy certificates, welcome packs, customer letters, and endorsements — eliminating manual document production.</w:t>
+        <w:t>Built Cortex — a local Ollama-powered AI agent that indexes the full monorepo and answers natural-language questions about business logic and defect root-cause for onboarding and incident triage.</w:t>
       </w:r>
     </w:p>
     <w:p xmlns:wp14="http://schemas.microsoft.com/office/word/2010/wordml" wp14:textId="77777777">
@@ -1514,23 +2859,99 @@
           <w:numId w:val="2"/>
         </w:numPr>
         <w:spacing w:before="20" w:after="20"/>
-        <w:rPr>
-          <w:rFonts w:ascii="Calibri" w:hAnsi="Calibri" w:eastAsia="Calibri" w:cs="Calibri"/>
-          <w:color w:val="000000"/>
-          <w:sz w:val="19"/>
-          <w:szCs w:val="19"/>
-          <w:lang w:val="en-US"/>
-        </w:rPr>
-      </w:pPr>
-      <w:r>
-        <w:rPr>
-          <w:rFonts w:ascii="Calibri" w:hAnsi="Calibri" w:eastAsia="Calibri" w:cs="Calibri"/>
-          <w:color w:val="000000"/>
-          <w:sz w:val="19"/>
-          <w:szCs w:val="19"/>
-          <w:lang w:val="en-US"/>
-        </w:rPr>
-        <w:t>Managed Stripe financial reporting, connected account notifications, and account balance monitoring integrations.</w:t>
+        <w:rPr/>
+      </w:pPr>
+      <w:r>
+        <w:rPr>
+          <w:rFonts w:ascii="Calibri" w:hAnsi="Calibri" w:eastAsia="Calibri" w:cs="Calibri"/>
+          <w:color w:val="000000"/>
+          <w:sz w:val="19"/>
+          <w:szCs w:val="19"/>
+          <w:lang w:val="en-US"/>
+        </w:rPr>
+        <w:t>Implemented AI code generation: scaffolded .NET Core APIs, CQRS/MediatR handlers, Vue 2 components, and T-SQL from user stories using Cursor/Claude Code with MCP context.</w:t>
+      </w:r>
+    </w:p>
+    <w:p xmlns:wp14="http://schemas.microsoft.com/office/word/2010/wordml" wp14:textId="77777777">
+      <w:pPr>
+        <w:pStyle w:val="ListParagraph"/>
+        <w:numPr>
+          <w:ilvl w:val="0"/>
+          <w:numId w:val="2"/>
+        </w:numPr>
+        <w:spacing w:before="20" w:after="20"/>
+        <w:rPr/>
+      </w:pPr>
+      <w:r>
+        <w:rPr>
+          <w:rFonts w:ascii="Calibri" w:hAnsi="Calibri" w:eastAsia="Calibri" w:cs="Calibri"/>
+          <w:color w:val="000000"/>
+          <w:sz w:val="19"/>
+          <w:szCs w:val="19"/>
+          <w:lang w:val="en-US"/>
+        </w:rPr>
+        <w:t>Implemented AI test generation: auto-generated xUnit/NUnit + Moq unit tests and WebApplicationFactory integration scaffolds with full AAA structure.</w:t>
+      </w:r>
+    </w:p>
+    <w:p xmlns:wp14="http://schemas.microsoft.com/office/word/2010/wordml" wp14:textId="77777777">
+      <w:pPr>
+        <w:pStyle w:val="ListParagraph"/>
+        <w:numPr>
+          <w:ilvl w:val="0"/>
+          <w:numId w:val="2"/>
+        </w:numPr>
+        <w:spacing w:before="20" w:after="20"/>
+      </w:pPr>
+      <w:r>
+        <w:rPr>
+          <w:rFonts w:ascii="Calibri" w:hAnsi="Calibri" w:eastAsia="Calibri" w:cs="Calibri"/>
+          <w:color w:val="000000"/>
+          <w:sz w:val="19"/>
+          <w:szCs w:val="19"/>
+        </w:rPr>
+        <w:t xml:space="preserve">Implemented AI pre-PR code review: diff analysis scanning for SOLID violations, OWASP Top 10, null/async issues, and PCI exposure before human review.</w:t>
+      </w:r>
+    </w:p>
+    <w:p xmlns:wp14="http://schemas.microsoft.com/office/word/2010/wordml" wp14:textId="77777777">
+      <w:pPr>
+        <w:pStyle w:val="ListParagraph"/>
+        <w:numPr>
+          <w:ilvl w:val="0"/>
+          <w:numId w:val="2"/>
+        </w:numPr>
+        <w:spacing w:before="20" w:after="20"/>
+        <w:rPr/>
+      </w:pPr>
+      <w:r>
+        <w:rPr>
+          <w:rFonts w:ascii="Calibri" w:hAnsi="Calibri" w:eastAsia="Calibri" w:cs="Calibri"/>
+          <w:color w:val="000000"/>
+          <w:sz w:val="19"/>
+          <w:szCs w:val="19"/>
+          <w:lang w:val="en-US"/>
+        </w:rPr>
+        <w:t>Led DataDog observability rollout across 10+ services — established dashboards, alerting rules, and runbooks that cut mean time to resolution (MTTR) for production incidents.</w:t>
+      </w:r>
+    </w:p>
+    <w:p xmlns:wp14="http://schemas.microsoft.com/office/word/2010/wordml" wp14:textId="77777777">
+      <w:pPr>
+        <w:pStyle w:val="ListParagraph"/>
+        <w:numPr>
+          <w:ilvl w:val="0"/>
+          <w:numId w:val="2"/>
+        </w:numPr>
+        <w:spacing w:before="20" w:after="20"/>
+        <w:rPr/>
+      </w:pPr>
+      <w:r>
+        <w:rPr>
+          <w:rFonts w:ascii="Calibri" w:hAnsi="Calibri" w:eastAsia="Calibri" w:cs="Calibri"/>
+          <w:color w:val="000000"/>
+          <w:sz w:val="19"/>
+          <w:szCs w:val="19"/>
+          <w:lang w:val="en-US"/>
+        </w:rPr>
+        <w:t>Created NFS Framework .NET DataDog NuGet package providing plug-and-play instrumentation for Web APIs, Azure Functions, and Hosted Services, adopted across all services.</w:t>
       </w:r>
     </w:p>
     <w:p>
@@ -1541,33 +2962,6 @@
           <w:numId w:val="2"/>
         </w:numPr>
         <w:spacing w:before="20" w:after="20"/>
-        <w:rPr>
-          <w:rFonts w:ascii="Calibri" w:hAnsi="Calibri" w:eastAsia="Calibri" w:cs="Calibri"/>
-          <w:color w:val="000000"/>
-          <w:sz w:val="19"/>
-          <w:szCs w:val="19"/>
-          <w:lang w:val="en-US"/>
-        </w:rPr>
-      </w:pPr>
-      <w:r>
-        <w:rPr>
-          <w:rFonts w:ascii="Calibri" w:hAnsi="Calibri" w:eastAsia="Calibri" w:cs="Calibri"/>
-          <w:color w:val="000000"/>
-          <w:sz w:val="19"/>
-          <w:szCs w:val="19"/>
-          <w:lang w:val="en-US"/>
-        </w:rPr>
-        <w:t>Using Python developed solutions for masking PCI-sensitive data in ELK/Elasticsearch (regex redaction) and for data migration from Elasticsearch to Datadog, including dashboards and alerts.</w:t>
-      </w:r>
-    </w:p>
-    <w:p xmlns:wp14="http://schemas.microsoft.com/office/word/2010/wordml" wp14:textId="77777777">
-      <w:pPr>
-        <w:pStyle w:val="ListParagraph"/>
-        <w:numPr>
-          <w:ilvl w:val="0"/>
-          <w:numId w:val="2"/>
-        </w:numPr>
-        <w:spacing w:before="20" w:after="20"/>
         <w:rPr/>
       </w:pPr>
       <w:r>
@@ -1578,48 +2972,10 @@
           <w:szCs w:val="19"/>
           <w:lang w:val="en-US"/>
         </w:rPr>
-        <w:t>Supported major reinsurer and branding transitions (GenRe → Munich Re Canada; AIG Life → Aviva Protection Limited) with zero data-loss migration.</w:t>
-      </w:r>
-    </w:p>
-    <w:p xmlns:wp14="http://schemas.microsoft.com/office/word/2010/wordml" wp14:textId="77777777">
-      <w:pPr>
-        <w:pStyle w:val="ListParagraph"/>
-        <w:numPr>
-          <w:ilvl w:val="0"/>
-          <w:numId w:val="2"/>
-        </w:numPr>
-        <w:spacing w:before="20" w:after="20"/>
-      </w:pPr>
-      <w:r>
-        <w:rPr>
-          <w:rFonts w:ascii="Calibri" w:hAnsi="Calibri" w:eastAsia="Calibri" w:cs="Calibri"/>
-          <w:color w:val="000000"/>
-          <w:sz w:val="19"/>
-          <w:szCs w:val="19"/>
-        </w:rPr>
-        <w:t xml:space="preserve">Architected team AI-augmented SDLC end-to-end integrating Claude Code, Cursor IDE, and GitHub Copilot — accelerating sprint velocity and reducing code-review turnaround.</w:t>
-      </w:r>
-    </w:p>
-    <w:p xmlns:wp14="http://schemas.microsoft.com/office/word/2010/wordml" wp14:textId="77777777">
-      <w:pPr>
-        <w:pStyle w:val="ListParagraph"/>
-        <w:numPr>
-          <w:ilvl w:val="0"/>
-          <w:numId w:val="2"/>
-        </w:numPr>
-        <w:spacing w:before="20" w:after="20"/>
-      </w:pPr>
-      <w:r>
-        <w:rPr>
-          <w:rFonts w:ascii="Calibri" w:hAnsi="Calibri" w:eastAsia="Calibri" w:cs="Calibri"/>
-          <w:color w:val="000000"/>
-          <w:sz w:val="19"/>
-          <w:szCs w:val="19"/>
-        </w:rPr>
-        <w:t xml:space="preserve">Built a custom MCP (Model Context Protocol) server that injects repo-specific Agents.md, architecture rules, and coding standards into AI editor sessions.</w:t>
-      </w:r>
-    </w:p>
-    <w:p xmlns:wp14="http://schemas.microsoft.com/office/word/2010/wordml" wp14:textId="77777777">
+        <w:t>Led requirement gathering and solution design for complex insurance/financial business problems within application architecture boundaries.</w:t>
+      </w:r>
+    </w:p>
+    <w:p>
       <w:pPr>
         <w:pStyle w:val="ListParagraph"/>
         <w:numPr>
@@ -1637,113 +2993,10 @@
           <w:szCs w:val="19"/>
           <w:lang w:val="en-US"/>
         </w:rPr>
-        <w:t>Built Cortex — a local Ollama-powered AI agent that indexes the full monorepo and answers natural-language questions about business logic and defect root-cause for onboarding and incident triage.</w:t>
-      </w:r>
-    </w:p>
-    <w:p xmlns:wp14="http://schemas.microsoft.com/office/word/2010/wordml" wp14:textId="77777777">
-      <w:pPr>
-        <w:pStyle w:val="ListParagraph"/>
-        <w:numPr>
-          <w:ilvl w:val="0"/>
-          <w:numId w:val="2"/>
-        </w:numPr>
-        <w:spacing w:before="20" w:after="20"/>
-        <w:rPr/>
-      </w:pPr>
-      <w:r>
-        <w:rPr>
-          <w:rFonts w:ascii="Calibri" w:hAnsi="Calibri" w:eastAsia="Calibri" w:cs="Calibri"/>
-          <w:color w:val="000000"/>
-          <w:sz w:val="19"/>
-          <w:szCs w:val="19"/>
-          <w:lang w:val="en-US"/>
-        </w:rPr>
-        <w:t>Implemented AI code generation: scaffolded .NET Core APIs, CQRS/MediatR handlers, Vue 2 components, and T-SQL from user stories using Cursor/Claude Code with MCP context.</w:t>
-      </w:r>
-    </w:p>
-    <w:p xmlns:wp14="http://schemas.microsoft.com/office/word/2010/wordml" wp14:textId="77777777">
-      <w:pPr>
-        <w:pStyle w:val="ListParagraph"/>
-        <w:numPr>
-          <w:ilvl w:val="0"/>
-          <w:numId w:val="2"/>
-        </w:numPr>
-        <w:spacing w:before="20" w:after="20"/>
-        <w:rPr/>
-      </w:pPr>
-      <w:r>
-        <w:rPr>
-          <w:rFonts w:ascii="Calibri" w:hAnsi="Calibri" w:eastAsia="Calibri" w:cs="Calibri"/>
-          <w:color w:val="000000"/>
-          <w:sz w:val="19"/>
-          <w:szCs w:val="19"/>
-          <w:lang w:val="en-US"/>
-        </w:rPr>
-        <w:t>Implemented AI test generation: auto-generated xUnit/NUnit + Moq unit tests and WebApplicationFactory integration scaffolds with full AAA structure.</w:t>
-      </w:r>
-    </w:p>
-    <w:p xmlns:wp14="http://schemas.microsoft.com/office/word/2010/wordml" wp14:textId="77777777">
-      <w:pPr>
-        <w:pStyle w:val="ListParagraph"/>
-        <w:numPr>
-          <w:ilvl w:val="0"/>
-          <w:numId w:val="2"/>
-        </w:numPr>
-        <w:spacing w:before="20" w:after="20"/>
-      </w:pPr>
-      <w:r>
-        <w:rPr>
-          <w:rFonts w:ascii="Calibri" w:hAnsi="Calibri" w:eastAsia="Calibri" w:cs="Calibri"/>
-          <w:color w:val="000000"/>
-          <w:sz w:val="19"/>
-          <w:szCs w:val="19"/>
-        </w:rPr>
-        <w:t xml:space="preserve">Implemented AI pre-PR code review: diff analysis scanning for SOLID violations, OWASP Top 10, null/async issues, and PCI exposure before human review.</w:t>
-      </w:r>
-    </w:p>
-    <w:p xmlns:wp14="http://schemas.microsoft.com/office/word/2010/wordml" wp14:textId="77777777">
-      <w:pPr>
-        <w:pStyle w:val="ListParagraph"/>
-        <w:numPr>
-          <w:ilvl w:val="0"/>
-          <w:numId w:val="2"/>
-        </w:numPr>
-        <w:spacing w:before="20" w:after="20"/>
-        <w:rPr/>
-      </w:pPr>
-      <w:r>
-        <w:rPr>
-          <w:rFonts w:ascii="Calibri" w:hAnsi="Calibri" w:eastAsia="Calibri" w:cs="Calibri"/>
-          <w:color w:val="000000"/>
-          <w:sz w:val="19"/>
-          <w:szCs w:val="19"/>
-          <w:lang w:val="en-US"/>
-        </w:rPr>
-        <w:t>Led DataDog observability rollout across 10+ services — established dashboards, alerting rules, and runbooks that cut mean time to resolution (MTTR) for production incidents.</w:t>
-      </w:r>
-    </w:p>
-    <w:p xmlns:wp14="http://schemas.microsoft.com/office/word/2010/wordml" wp14:textId="77777777">
-      <w:pPr>
-        <w:pStyle w:val="ListParagraph"/>
-        <w:numPr>
-          <w:ilvl w:val="0"/>
-          <w:numId w:val="2"/>
-        </w:numPr>
-        <w:spacing w:before="20" w:after="20"/>
-        <w:rPr/>
-      </w:pPr>
-      <w:r>
-        <w:rPr>
-          <w:rFonts w:ascii="Calibri" w:hAnsi="Calibri" w:eastAsia="Calibri" w:cs="Calibri"/>
-          <w:color w:val="000000"/>
-          <w:sz w:val="19"/>
-          <w:szCs w:val="19"/>
-          <w:lang w:val="en-US"/>
-        </w:rPr>
-        <w:t>Created NFS Framework .NET DataDog NuGet package providing plug-and-play instrumentation for Web APIs, Azure Functions, and Hosted Services, adopted across all services.</w:t>
-      </w:r>
-    </w:p>
-    <w:p xmlns:wp14="http://schemas.microsoft.com/office/word/2010/wordml" wp14:textId="77777777">
+        <w:t>Contributed across full SDLC — analysis, design, coding, code review, unit testing, configuration, and deployment.</w:t>
+      </w:r>
+    </w:p>
+    <w:p xmlns:wp14="http://schemas.microsoft.com/office/word/2010/wordml" wp14:textId="18E0DC45">
       <w:pPr>
         <w:spacing w:before="40" w:after="40"/>
       </w:pPr>
@@ -1757,8 +3010,94 @@
           <w:szCs w:val="17"/>
           <w:lang w:val="en-US"/>
         </w:rPr>
-        <w:t>Environment: C#, ASP.NET Core, .NET Core Web API, Azure AI Foundry, Semantic Kernel, Claude Code, Cursor IDE, GitHub Copilot, MCP, Agents.md, ElasticSearch, DataDog, Vue 2, T-SQL, SQL Server, Azure Cloud.</w:t>
-      </w:r>
+        <w:t xml:space="preserve">Environment: C#, ASP.NET MVC, ASP.NET Core, .NET Core Web API, </w:t>
+      </w:r>
+      <w:r>
+        <w:rPr>
+          <w:rFonts w:ascii="Calibri" w:hAnsi="Calibri" w:eastAsia="Calibri" w:cs="Calibri"/>
+          <w:i w:val="1"/>
+          <w:iCs w:val="1"/>
+          <w:color w:val="000000"/>
+          <w:sz w:val="17"/>
+          <w:szCs w:val="17"/>
+          <w:lang w:val="en-US"/>
+        </w:rPr>
+        <w:t xml:space="preserve">WPF, </w:t>
+      </w:r>
+      <w:r>
+        <w:rPr>
+          <w:rFonts w:ascii="Calibri" w:hAnsi="Calibri" w:eastAsia="Calibri" w:cs="Calibri"/>
+          <w:i w:val="1"/>
+          <w:iCs w:val="1"/>
+          <w:color w:val="000000"/>
+          <w:sz w:val="17"/>
+          <w:szCs w:val="17"/>
+          <w:lang w:val="en-US"/>
+        </w:rPr>
+        <w:t xml:space="preserve">Azure AI Foundry, Semantic Kernel, Claude Code, Cursor IDE, GitHub Copilot, MCP, Agents.md, </w:t>
+      </w:r>
+      <w:r>
+        <w:rPr>
+          <w:rFonts w:ascii="Calibri" w:hAnsi="Calibri" w:eastAsia="Calibri" w:cs="Calibri"/>
+          <w:i w:val="1"/>
+          <w:iCs w:val="1"/>
+          <w:color w:val="000000"/>
+          <w:sz w:val="17"/>
+          <w:szCs w:val="17"/>
+          <w:lang w:val="en-US"/>
+        </w:rPr>
+        <w:t>ElasticSearch</w:t>
+      </w:r>
+      <w:r>
+        <w:rPr>
+          <w:rFonts w:ascii="Calibri" w:hAnsi="Calibri" w:eastAsia="Calibri" w:cs="Calibri"/>
+          <w:i w:val="1"/>
+          <w:iCs w:val="1"/>
+          <w:color w:val="000000"/>
+          <w:sz w:val="17"/>
+          <w:szCs w:val="17"/>
+          <w:lang w:val="en-US"/>
+        </w:rPr>
+        <w:t xml:space="preserve">, </w:t>
+      </w:r>
+      <w:r>
+        <w:rPr>
+          <w:rFonts w:ascii="Calibri" w:hAnsi="Calibri" w:eastAsia="Calibri" w:cs="Calibri"/>
+          <w:i w:val="1"/>
+          <w:iCs w:val="1"/>
+          <w:color w:val="000000"/>
+          <w:sz w:val="17"/>
+          <w:szCs w:val="17"/>
+          <w:lang w:val="en-US"/>
+        </w:rPr>
+        <w:t>DataDog</w:t>
+      </w:r>
+      <w:r>
+        <w:rPr>
+          <w:rFonts w:ascii="Calibri" w:hAnsi="Calibri" w:eastAsia="Calibri" w:cs="Calibri"/>
+          <w:i w:val="1"/>
+          <w:iCs w:val="1"/>
+          <w:color w:val="000000"/>
+          <w:sz w:val="17"/>
+          <w:szCs w:val="17"/>
+          <w:lang w:val="en-US"/>
+        </w:rPr>
+        <w:t>, Vue 2, T-SQL, SQL Server, Azure Cloud.</w:t>
+      </w:r>
+    </w:p>
+    <w:p>
+      <w:pPr>
+        <w:spacing w:before="40" w:after="40"/>
+        <w:rPr>
+          <w:rFonts w:ascii="Calibri" w:hAnsi="Calibri" w:eastAsia="Calibri" w:cs="Calibri"/>
+          <w:i w:val="1"/>
+          <w:iCs w:val="1"/>
+          <w:color w:val="000000"/>
+          <w:sz w:val="17"/>
+          <w:szCs w:val="17"/>
+          <w:lang w:val="en-US"/>
+        </w:rPr>
+      </w:pPr>
     </w:p>
     <w:p xmlns:wp14="http://schemas.microsoft.com/office/word/2010/wordml" wp14:textId="6548C71D">
       <w:pPr>
@@ -1852,7 +3191,7 @@
         <w:t>May 2020 – Nov 2021</w:t>
       </w:r>
     </w:p>
-    <w:p xmlns:wp14="http://schemas.microsoft.com/office/word/2010/wordml" wp14:textId="77777777">
+    <w:p xmlns:wp14="http://schemas.microsoft.com/office/word/2010/wordml" wp14:textId="13BF0025">
       <w:pPr>
         <w:spacing w:before="0" w:after="40"/>
       </w:pPr>
@@ -1866,17 +3205,70 @@
           <w:szCs w:val="19"/>
           <w:lang w:val="en-US"/>
         </w:rPr>
-        <w:t>Senior .NET Developer</w:t>
-      </w:r>
-      <w:r>
-        <w:rPr>
-          <w:rFonts w:ascii="Calibri" w:hAnsi="Calibri" w:eastAsia="Calibri" w:cs="Calibri"/>
-          <w:color w:val="000000"/>
-          <w:sz w:val="19"/>
-          <w:szCs w:val="19"/>
-          <w:lang w:val="en-US"/>
-        </w:rPr>
-        <w:t xml:space="preserve">  |  Domain: Utilities</w:t>
+        <w:t xml:space="preserve">Senior .NET </w:t>
+      </w:r>
+      <w:r>
+        <w:rPr>
+          <w:rFonts w:ascii="Calibri" w:hAnsi="Calibri" w:eastAsia="Calibri" w:cs="Calibri"/>
+          <w:i w:val="1"/>
+          <w:iCs w:val="1"/>
+          <w:color w:val="000000"/>
+          <w:sz w:val="19"/>
+          <w:szCs w:val="19"/>
+          <w:lang w:val="en-US"/>
+        </w:rPr>
+        <w:t>Developer |</w:t>
+      </w:r>
+      <w:r>
+        <w:rPr>
+          <w:rFonts w:ascii="Calibri" w:hAnsi="Calibri" w:eastAsia="Calibri" w:cs="Calibri"/>
+          <w:color w:val="000000"/>
+          <w:sz w:val="19"/>
+          <w:szCs w:val="19"/>
+          <w:lang w:val="en-US"/>
+        </w:rPr>
+        <w:t xml:space="preserve">  Domain: Utilities</w:t>
+      </w:r>
+    </w:p>
+    <w:p xmlns:wp14="http://schemas.microsoft.com/office/word/2010/wordml" wp14:textId="66137525">
+      <w:pPr>
+        <w:pStyle w:val="ListParagraph"/>
+        <w:numPr>
+          <w:ilvl w:val="0"/>
+          <w:numId w:val="2"/>
+        </w:numPr>
+        <w:spacing w:before="20" w:after="20"/>
+        <w:rPr/>
+      </w:pPr>
+      <w:r>
+        <w:rPr>
+          <w:rFonts w:ascii="Calibri" w:hAnsi="Calibri" w:eastAsia="Calibri" w:cs="Calibri"/>
+          <w:color w:val="000000"/>
+          <w:sz w:val="19"/>
+          <w:szCs w:val="19"/>
+          <w:lang w:val="en-US"/>
+        </w:rPr>
+        <w:t xml:space="preserve">Developed Microservices APIs (Move-In/Move-Out, Transfer Services, Payment Location, Experian Credit Check) for </w:t>
+      </w:r>
+      <w:r>
+        <w:rPr>
+          <w:rFonts w:ascii="Calibri" w:hAnsi="Calibri" w:eastAsia="Calibri" w:cs="Calibri"/>
+          <w:color w:val="000000"/>
+          <w:sz w:val="19"/>
+          <w:szCs w:val="19"/>
+          <w:lang w:val="en-US"/>
+        </w:rPr>
+        <w:t>Southwest</w:t>
+      </w:r>
+      <w:r>
+        <w:rPr>
+          <w:rFonts w:ascii="Calibri" w:hAnsi="Calibri" w:eastAsia="Calibri" w:cs="Calibri"/>
+          <w:color w:val="000000"/>
+          <w:sz w:val="19"/>
+          <w:szCs w:val="19"/>
+          <w:lang w:val="en-US"/>
+        </w:rPr>
+        <w:t xml:space="preserve"> Gas implementation using Clean DDD, CQRS, and TDD.</w:t>
       </w:r>
     </w:p>
     <w:p xmlns:wp14="http://schemas.microsoft.com/office/word/2010/wordml" wp14:textId="77777777">
@@ -1887,17 +3279,15 @@
           <w:numId w:val="2"/>
         </w:numPr>
         <w:spacing w:before="20" w:after="20"/>
-        <w:rPr/>
-      </w:pPr>
-      <w:r>
-        <w:rPr>
-          <w:rFonts w:ascii="Calibri" w:hAnsi="Calibri" w:eastAsia="Calibri" w:cs="Calibri"/>
-          <w:color w:val="000000"/>
-          <w:sz w:val="19"/>
-          <w:szCs w:val="19"/>
-          <w:lang w:val="en-US"/>
-        </w:rPr>
-        <w:t>Developed Microservices APIs (Move-In/Move-Out, Transfer Services, Payment Location, Experian Credit Check) for South West Gas implementation using Clean DDD, CQRS, and TDD.</w:t>
+      </w:pPr>
+      <w:r>
+        <w:rPr>
+          <w:rFonts w:ascii="Calibri" w:hAnsi="Calibri" w:eastAsia="Calibri" w:cs="Calibri"/>
+          <w:color w:val="000000"/>
+          <w:sz w:val="19"/>
+          <w:szCs w:val="19"/>
+        </w:rPr>
+        <w:t xml:space="preserve">Built AI/Analytics reporting module delivering Paperless Enrollment, Auto Pay Enrollment, Registration Logs, User Login History, and Credit/ID Check Reports for utility clients.</w:t>
       </w:r>
     </w:p>
     <w:p xmlns:wp14="http://schemas.microsoft.com/office/word/2010/wordml" wp14:textId="77777777">
@@ -1916,7 +3306,7 @@
           <w:sz w:val="19"/>
           <w:szCs w:val="19"/>
         </w:rPr>
-        <w:t xml:space="preserve">Built AI/Analytics reporting module delivering Paperless Enrollment, Auto Pay Enrollment, Registration Logs, User Login History, and Credit/ID Check Reports for utility clients.</w:t>
+        <w:t xml:space="preserve">Developed a flexible E-Bill retrieval API supporting multiple sources: local file system, SFTP, and Azure Blob Storage.</w:t>
       </w:r>
     </w:p>
     <w:p xmlns:wp14="http://schemas.microsoft.com/office/word/2010/wordml" wp14:textId="77777777">
@@ -1935,42 +3325,23 @@
           <w:sz w:val="19"/>
           <w:szCs w:val="19"/>
         </w:rPr>
-        <w:t xml:space="preserve">Developed a flexible E-Bill retrieval API supporting multiple sources: local file system, SFTP, and Azure Blob Storage.</w:t>
-      </w:r>
-    </w:p>
-    <w:p xmlns:wp14="http://schemas.microsoft.com/office/word/2010/wordml" wp14:textId="77777777">
-      <w:pPr>
-        <w:pStyle w:val="ListParagraph"/>
-        <w:numPr>
-          <w:ilvl w:val="0"/>
-          <w:numId w:val="2"/>
-        </w:numPr>
-        <w:spacing w:before="20" w:after="20"/>
-      </w:pPr>
-      <w:r>
-        <w:rPr>
-          <w:rFonts w:ascii="Calibri" w:hAnsi="Calibri" w:eastAsia="Calibri" w:cs="Calibri"/>
-          <w:color w:val="000000"/>
-          <w:sz w:val="19"/>
-          <w:szCs w:val="19"/>
-        </w:rPr>
         <w:t xml:space="preserve">Resolved production defects and delivered enhancements across SFPUC and Liberty Utility implementations.</w:t>
       </w:r>
     </w:p>
-    <w:p xmlns:wp14="http://schemas.microsoft.com/office/word/2010/wordml" wp14:textId="77777777">
+    <w:p>
       <w:pPr>
         <w:spacing w:before="40" w:after="40"/>
       </w:pPr>
       <w:r>
         <w:rPr>
           <w:rFonts w:ascii="Calibri" w:hAnsi="Calibri" w:eastAsia="Calibri" w:cs="Calibri"/>
-          <w:i/>
-          <w:iCs/>
+          <w:i w:val="1"/>
+          <w:iCs w:val="1"/>
           <w:color w:val="000000"/>
           <w:sz w:val="17"/>
           <w:szCs w:val="17"/>
         </w:rPr>
-        <w:t xml:space="preserve">Environment: C#, ASP.NET Core, .NET Core Web API, PostgreSQL, ReactJS, Angular, T-SQL, SQL Server, Azure Cloud, IIS.</w:t>
+        <w:t>Environment: C#, ASP.NET MVC, ASP.NET Core, .NET Core Web API, PostgreSQL, ReactJS, Angular, JavaScript, HTML, CSS, T-SQL, SQL Server, Azure Cloud, IIS, TFS.</w:t>
       </w:r>
     </w:p>
     <w:p xmlns:wp14="http://schemas.microsoft.com/office/word/2010/wordml" wp14:textId="46CB9ACC">
@@ -2187,15 +3558,42 @@
           <w:numId w:val="2"/>
         </w:numPr>
         <w:spacing w:before="20" w:after="20"/>
-      </w:pPr>
-      <w:r>
-        <w:rPr>
-          <w:rFonts w:ascii="Calibri" w:hAnsi="Calibri" w:eastAsia="Calibri" w:cs="Calibri"/>
-          <w:color w:val="000000"/>
-          <w:sz w:val="19"/>
-          <w:szCs w:val="19"/>
-        </w:rPr>
-        <w:t xml:space="preserve">Enhanced EPIC Web Application Payroll Calculation Engine (.NET Core Web API + ReactJS).</w:t>
+        <w:rPr>
+          <w:rFonts w:ascii="Calibri" w:hAnsi="Calibri" w:eastAsia="Calibri" w:cs="Calibri"/>
+          <w:color w:val="000000"/>
+          <w:sz w:val="19"/>
+          <w:szCs w:val="19"/>
+        </w:rPr>
+      </w:pPr>
+      <w:r>
+        <w:rPr>
+          <w:rFonts w:ascii="Calibri" w:hAnsi="Calibri" w:eastAsia="Calibri" w:cs="Calibri"/>
+          <w:color w:val="000000"/>
+          <w:sz w:val="19"/>
+          <w:szCs w:val="19"/>
+        </w:rPr>
+        <w:t>Enhanced EPIC Web Application Payroll Calculation Engine (.NET Core Web API + ReactJS).</w:t>
+      </w:r>
+    </w:p>
+    <w:p>
+      <w:pPr>
+        <w:pStyle w:val="ListParagraph"/>
+        <w:numPr>
+          <w:ilvl w:val="0"/>
+          <w:numId w:val="2"/>
+        </w:numPr>
+        <w:spacing w:before="20" w:after="20"/>
+        <w:rPr/>
+      </w:pPr>
+      <w:r>
+        <w:rPr>
+          <w:rFonts w:ascii="Calibri" w:hAnsi="Calibri" w:eastAsia="Calibri" w:cs="Calibri"/>
+          <w:color w:val="000000"/>
+          <w:sz w:val="19"/>
+          <w:szCs w:val="19"/>
+          <w:lang w:val="en-GB"/>
+        </w:rPr>
+        <w:t>Architected and developed phased wise modernization of legacy monolithic applications to microservice based REST APIs</w:t>
       </w:r>
     </w:p>
     <w:p xmlns:wp14="http://schemas.microsoft.com/office/word/2010/wordml" wp14:textId="77777777">
@@ -2205,14 +3603,27 @@
       <w:r>
         <w:rPr>
           <w:rFonts w:ascii="Calibri" w:hAnsi="Calibri" w:eastAsia="Calibri" w:cs="Calibri"/>
-          <w:i/>
-          <w:iCs/>
+          <w:i w:val="1"/>
+          <w:iCs w:val="1"/>
           <w:color w:val="000000"/>
           <w:sz w:val="17"/>
           <w:szCs w:val="17"/>
         </w:rPr>
-        <w:t xml:space="preserve">Environment: C#, ASP.NET Core, .NET Core Web API, Angular, ReactJS, VB.NET, Ocelot Gateway, SQL Server, Azure Cloud, Git.</w:t>
-      </w:r>
+        <w:t>Environment: C#, ASP.NET Core, .NET Core Web API, Angular, ReactJS, VB.NET, Ocelot Gateway, SQL Server, Azure Cloud, Git.</w:t>
+      </w:r>
+    </w:p>
+    <w:p>
+      <w:pPr>
+        <w:spacing w:before="40" w:after="40"/>
+        <w:rPr>
+          <w:rFonts w:ascii="Calibri" w:hAnsi="Calibri" w:eastAsia="Calibri" w:cs="Calibri"/>
+          <w:i w:val="1"/>
+          <w:iCs w:val="1"/>
+          <w:color w:val="000000"/>
+          <w:sz w:val="17"/>
+          <w:szCs w:val="17"/>
+        </w:rPr>
+      </w:pPr>
     </w:p>
     <w:p xmlns:wp14="http://schemas.microsoft.com/office/word/2010/wordml" wp14:textId="774ADB13">
       <w:pPr>
@@ -2677,25 +4088,137 @@
         <w:t>Tata Consultancy Services (TCS)  |  Jan 2006 – Apr 2009</w:t>
       </w:r>
     </w:p>
-    <w:p xmlns:wp14="http://schemas.microsoft.com/office/word/2010/wordml" wp14:textId="77777777">
-      <w:pPr>
-        <w:pStyle w:val="ListParagraph"/>
-        <w:numPr>
-          <w:ilvl w:val="0"/>
-          <w:numId w:val="2"/>
-        </w:numPr>
-        <w:spacing w:before="20" w:after="20"/>
-        <w:rPr/>
-      </w:pPr>
-      <w:r>
-        <w:rPr>
-          <w:rFonts w:ascii="Calibri" w:hAnsi="Calibri" w:eastAsia="Calibri" w:cs="Calibri"/>
-          <w:color w:val="000000"/>
-          <w:sz w:val="19"/>
-          <w:szCs w:val="19"/>
-          <w:lang w:val="en-US"/>
-        </w:rPr>
-        <w:t>Multiple global client engagements: Nuffield Health UK (Healthcare), Credit Suisse Switzerland (BFSI), Agilent Technologies USA (HiTech), HAYS Recruitment London UK (HR/SharePoint), Commerzbank Germany (BFSI), Geologix UK (Energy/WCF), Barista Lavazza Italy (Retail POS/SAP).</w:t>
+    <w:p>
+      <w:pPr>
+        <w:pStyle w:val="ListParagraph"/>
+        <w:numPr>
+          <w:ilvl w:val="0"/>
+          <w:numId w:val="2"/>
+        </w:numPr>
+        <w:spacing w:before="20" w:after="20"/>
+      </w:pPr>
+      <w:r>
+        <w:rPr>
+          <w:rFonts w:ascii="Calibri" w:hAnsi="Calibri" w:eastAsia="Calibri" w:cs="Calibri"/>
+          <w:color w:val="000000"/>
+          <w:sz w:val="19"/>
+          <w:szCs w:val="19"/>
+        </w:rPr>
+        <w:t>Nuffield Health – Epsom, UK (Healthcare) — POC and project estimation for patient Appointment Module using WCF-based SOA services.</w:t>
+      </w:r>
+    </w:p>
+    <w:p>
+      <w:pPr>
+        <w:pStyle w:val="ListParagraph"/>
+        <w:numPr>
+          <w:ilvl w:val="0"/>
+          <w:numId w:val="2"/>
+        </w:numPr>
+        <w:spacing w:before="20" w:after="20"/>
+      </w:pPr>
+      <w:r>
+        <w:rPr>
+          <w:rFonts w:ascii="Calibri" w:hAnsi="Calibri" w:eastAsia="Calibri" w:cs="Calibri"/>
+          <w:color w:val="000000"/>
+          <w:sz w:val="19"/>
+          <w:szCs w:val="19"/>
+        </w:rPr>
+        <w:t>Credit Suisse – Zurich, Switzerland (BFSI) — POC converting client-server accrual calculation app to WCF-based SOA architecture.</w:t>
+      </w:r>
+    </w:p>
+    <w:p>
+      <w:pPr>
+        <w:pStyle w:val="ListParagraph"/>
+        <w:numPr>
+          <w:ilvl w:val="0"/>
+          <w:numId w:val="2"/>
+        </w:numPr>
+        <w:spacing w:before="20" w:after="20"/>
+      </w:pPr>
+      <w:r>
+        <w:rPr>
+          <w:rFonts w:ascii="Calibri" w:hAnsi="Calibri" w:eastAsia="Calibri" w:cs="Calibri"/>
+          <w:color w:val="000000"/>
+          <w:sz w:val="19"/>
+          <w:szCs w:val="19"/>
+        </w:rPr>
+        <w:t>Agilent Technologies – Delaware, USA (HiTech) — RFP support with hands-on exploration of MOSS 2007 SharePoint features.</w:t>
+      </w:r>
+    </w:p>
+    <w:p>
+      <w:pPr>
+        <w:pStyle w:val="ListParagraph"/>
+        <w:numPr>
+          <w:ilvl w:val="0"/>
+          <w:numId w:val="2"/>
+        </w:numPr>
+        <w:spacing w:before="20" w:after="20"/>
+      </w:pPr>
+      <w:r>
+        <w:rPr>
+          <w:rFonts w:ascii="Calibri" w:hAnsi="Calibri" w:eastAsia="Calibri" w:cs="Calibri"/>
+          <w:color w:val="000000"/>
+          <w:sz w:val="19"/>
+          <w:szCs w:val="19"/>
+        </w:rPr>
+        <w:t>HAYS Recruitment – London, UK (HR) — Configured Bond Adapt tool and developed SharePoint web parts onsite in London.</w:t>
+      </w:r>
+    </w:p>
+    <w:p>
+      <w:pPr>
+        <w:pStyle w:val="ListParagraph"/>
+        <w:numPr>
+          <w:ilvl w:val="0"/>
+          <w:numId w:val="2"/>
+        </w:numPr>
+        <w:spacing w:before="20" w:after="20"/>
+      </w:pPr>
+      <w:r>
+        <w:rPr>
+          <w:rFonts w:ascii="Calibri" w:hAnsi="Calibri" w:eastAsia="Calibri" w:cs="Calibri"/>
+          <w:color w:val="000000"/>
+          <w:sz w:val="19"/>
+          <w:szCs w:val="19"/>
+        </w:rPr>
+        <w:t>Commerzbank – Frankfurt, Germany (BFSI) — POC for capital market risk management covering liquidity forecasting for SMEs.</w:t>
+      </w:r>
+    </w:p>
+    <w:p>
+      <w:pPr>
+        <w:pStyle w:val="ListParagraph"/>
+        <w:numPr>
+          <w:ilvl w:val="0"/>
+          <w:numId w:val="2"/>
+        </w:numPr>
+        <w:spacing w:before="20" w:after="20"/>
+      </w:pPr>
+      <w:r>
+        <w:rPr>
+          <w:rFonts w:ascii="Calibri" w:hAnsi="Calibri" w:eastAsia="Calibri" w:cs="Calibri"/>
+          <w:color w:val="000000"/>
+          <w:sz w:val="19"/>
+          <w:szCs w:val="19"/>
+        </w:rPr>
+        <w:t>Geologix Inc – Norwich, UK (Energy) — Developed GeoStore, a WITSML-based WCF/NHibernate SOA app for geological data storage/retrieval.</w:t>
+      </w:r>
+    </w:p>
+    <w:p>
+      <w:pPr>
+        <w:pStyle w:val="ListParagraph"/>
+        <w:numPr>
+          <w:ilvl w:val="0"/>
+          <w:numId w:val="2"/>
+        </w:numPr>
+        <w:spacing w:before="20" w:after="20"/>
+      </w:pPr>
+      <w:r>
+        <w:rPr>
+          <w:rFonts w:ascii="Calibri" w:hAnsi="Calibri" w:eastAsia="Calibri" w:cs="Calibri"/>
+          <w:color w:val="000000"/>
+          <w:sz w:val="19"/>
+          <w:szCs w:val="19"/>
+        </w:rPr>
+        <w:t>Barista Lavazza – Turin, Italy (Retail) — Implemented Project Brew Windows POS live across 100+ outlets with SAP ERP integration.</w:t>
       </w:r>
     </w:p>
     <w:p xmlns:wp14="http://schemas.microsoft.com/office/word/2010/wordml" wp14:textId="77777777">
@@ -2717,7 +4240,7 @@
         <w:t xml:space="preserve">EDUCATION</w:t>
       </w:r>
     </w:p>
-    <w:p xmlns:wp14="http://schemas.microsoft.com/office/word/2010/wordml" wp14:textId="77777777">
+    <w:p xmlns:wp14="http://schemas.microsoft.com/office/word/2010/wordml" wp14:textId="2C3B306F">
       <w:pPr>
         <w:tabs>
           <w:tab w:val="right" w:pos="9360"/>
@@ -2727,22 +4250,34 @@
       <w:r>
         <w:rPr>
           <w:rFonts w:ascii="Calibri" w:hAnsi="Calibri" w:eastAsia="Calibri" w:cs="Calibri"/>
-          <w:b/>
-          <w:bCs/>
-          <w:color w:val="000000"/>
-          <w:sz w:val="19"/>
-          <w:szCs w:val="19"/>
-        </w:rPr>
-        <w:t xml:space="preserve">Master of Computer Applications (MCA)</w:t>
-      </w:r>
-      <w:r>
-        <w:rPr>
-          <w:rFonts w:ascii="Calibri" w:hAnsi="Calibri" w:eastAsia="Calibri" w:cs="Calibri"/>
-          <w:color w:val="000000"/>
-          <w:sz w:val="19"/>
-          <w:szCs w:val="19"/>
-        </w:rPr>
-        <w:t xml:space="preserve">	Jul 2000 – Jul 2003</w:t>
+          <w:b w:val="1"/>
+          <w:bCs w:val="1"/>
+          <w:color w:val="000000"/>
+          <w:sz w:val="19"/>
+          <w:szCs w:val="19"/>
+        </w:rPr>
+        <w:t>Master of Computer Applications (MCA)</w:t>
+      </w:r>
+      <w:r>
+        <w:tab/>
+      </w:r>
+      <w:r>
+        <w:rPr>
+          <w:rFonts w:ascii="Calibri" w:hAnsi="Calibri" w:eastAsia="Calibri" w:cs="Calibri"/>
+          <w:color w:val="000000"/>
+          <w:sz w:val="19"/>
+          <w:szCs w:val="19"/>
+        </w:rPr>
+        <w:t>J</w:t>
+      </w:r>
+      <w:r>
+        <w:rPr>
+          <w:rFonts w:ascii="Calibri" w:hAnsi="Calibri" w:eastAsia="Calibri" w:cs="Calibri"/>
+          <w:color w:val="000000"/>
+          <w:sz w:val="19"/>
+          <w:szCs w:val="19"/>
+        </w:rPr>
+        <w:t>ul 2000 – Jul 2003</w:t>
       </w:r>
     </w:p>
     <w:p xmlns:wp14="http://schemas.microsoft.com/office/word/2010/wordml" wp14:textId="77777777">
@@ -2762,7 +4297,7 @@
         <w:t>DAV Institute of Management &amp; Technology  |  MD University Rohtak, Haryana, India</w:t>
       </w:r>
     </w:p>
-    <w:p xmlns:wp14="http://schemas.microsoft.com/office/word/2010/wordml" wp14:textId="77777777">
+    <w:p xmlns:wp14="http://schemas.microsoft.com/office/word/2010/wordml" wp14:textId="32CDF957">
       <w:pPr>
         <w:tabs>
           <w:tab w:val="right" w:pos="9360"/>
@@ -2772,22 +4307,34 @@
       <w:r>
         <w:rPr>
           <w:rFonts w:ascii="Calibri" w:hAnsi="Calibri" w:eastAsia="Calibri" w:cs="Calibri"/>
-          <w:b/>
-          <w:bCs/>
-          <w:color w:val="000000"/>
-          <w:sz w:val="19"/>
-          <w:szCs w:val="19"/>
-        </w:rPr>
-        <w:t xml:space="preserve">Bachelor of Science (B.Sc.)</w:t>
-      </w:r>
-      <w:r>
-        <w:rPr>
-          <w:rFonts w:ascii="Calibri" w:hAnsi="Calibri" w:eastAsia="Calibri" w:cs="Calibri"/>
-          <w:color w:val="000000"/>
-          <w:sz w:val="19"/>
-          <w:szCs w:val="19"/>
-        </w:rPr>
-        <w:t xml:space="preserve">	Jul 1997 – Jul 2000</w:t>
+          <w:b w:val="1"/>
+          <w:bCs w:val="1"/>
+          <w:color w:val="000000"/>
+          <w:sz w:val="19"/>
+          <w:szCs w:val="19"/>
+        </w:rPr>
+        <w:t>Bachelor of Science (B.Sc.)</w:t>
+      </w:r>
+      <w:r>
+        <w:tab/>
+      </w:r>
+      <w:r>
+        <w:rPr>
+          <w:rFonts w:ascii="Calibri" w:hAnsi="Calibri" w:eastAsia="Calibri" w:cs="Calibri"/>
+          <w:color w:val="000000"/>
+          <w:sz w:val="19"/>
+          <w:szCs w:val="19"/>
+        </w:rPr>
+        <w:t xml:space="preserve">  </w:t>
+      </w:r>
+      <w:r>
+        <w:rPr>
+          <w:rFonts w:ascii="Calibri" w:hAnsi="Calibri" w:eastAsia="Calibri" w:cs="Calibri"/>
+          <w:color w:val="000000"/>
+          <w:sz w:val="19"/>
+          <w:szCs w:val="19"/>
+        </w:rPr>
+        <w:t>Jul 1997 – Jul 2000</w:t>
       </w:r>
     </w:p>
     <w:p xmlns:wp14="http://schemas.microsoft.com/office/word/2010/wordml" wp14:textId="77777777">

</xml_diff>

<commit_message>
Sync portfolio content with latest resume including AWS cert and full experience.
</commit_message>
<xml_diff>
--- a/Website/Personal/Surya_Singh_Resume.docx
+++ b/Website/Personal/Surya_Singh_Resume.docx
@@ -1235,6 +1235,7 @@
         <w:tc>
           <w:tcPr>
             <w:tcW w:w="2820" w:type="dxa"/>
+            <w:tcMar/>
           </w:tcPr>
           <w:p wp14:textId="77777777">
             <w:r>
@@ -1245,14 +1246,37 @@
         <w:tc>
           <w:tcPr>
             <w:tcW w:w="2805" w:type="dxa"/>
+            <w:tcMar/>
           </w:tcPr>
-          <w:p wp14:textId="77777777">
-            <w:r/>
+          <w:p wp14:textId="43A676F3">
+            <w:pPr>
+              <w:pStyle w:val="Normal"/>
+              <w:rPr>
+                <w:rFonts w:ascii="Calibri" w:hAnsi="Calibri" w:eastAsia="Calibri" w:cs="Calibri"/>
+                <w:sz w:val="19"/>
+                <w:szCs w:val="19"/>
+              </w:rPr>
+            </w:pPr>
+            <w:r>
+              <w:rPr>
+                <w:rFonts w:ascii="Calibri" w:hAnsi="Calibri" w:eastAsia="Calibri" w:cs="Calibri"/>
+                <w:b w:val="0"/>
+                <w:bCs w:val="0"/>
+                <w:i w:val="0"/>
+                <w:iCs w:val="0"/>
+                <w:caps w:val="0"/>
+                <w:smallCaps w:val="0"/>
+                <w:sz w:val="19"/>
+                <w:szCs w:val="19"/>
+              </w:rPr>
+              <w:t>SAA-C03: AWS Certified: Solutions Architect Associate</w:t>
+            </w:r>
           </w:p>
         </w:tc>
         <w:tc>
           <w:tcPr>
             <w:tcW w:w="4725" w:type="dxa"/>
+            <w:tcMar/>
           </w:tcPr>
           <w:p wp14:textId="77777777">
             <w:r/>
@@ -1940,7 +1964,7 @@
           <w:szCs w:val="22"/>
           <w:lang w:val="en-US"/>
         </w:rPr>
-        <w:t>|  Domain</w:t>
+        <w:t>| Domain</w:t>
       </w:r>
       <w:r>
         <w:rPr>
@@ -2061,7 +2085,7 @@
           <w:szCs w:val="19"/>
           <w:lang w:val="en-US"/>
         </w:rPr>
-        <w:t xml:space="preserve"> Copilot/Amazon Q</w:t>
+        <w:t xml:space="preserve"> Copilot</w:t>
       </w:r>
       <w:r>
         <w:rPr>
@@ -2118,7 +2142,17 @@
           <w:szCs w:val="19"/>
           <w:lang w:val="en-US"/>
         </w:rPr>
-        <w:t xml:space="preserve"> framework.</w:t>
+        <w:t xml:space="preserve"> </w:t>
+      </w:r>
+      <w:r>
+        <w:rPr>
+          <w:rFonts w:ascii="Calibri" w:hAnsi="Calibri" w:eastAsia="Calibri" w:cs="Calibri"/>
+          <w:color w:val="000000"/>
+          <w:sz w:val="19"/>
+          <w:szCs w:val="19"/>
+          <w:lang w:val="en-US"/>
+        </w:rPr>
+        <w:t>framework. Working on Modernization of Essential time application via MDF6.</w:t>
       </w:r>
     </w:p>
     <w:p>
@@ -4134,13 +4168,15 @@
           <w:numId w:val="2"/>
         </w:numPr>
         <w:spacing w:before="20" w:after="20"/>
-      </w:pPr>
-      <w:r>
-        <w:rPr>
-          <w:rFonts w:ascii="Calibri" w:hAnsi="Calibri" w:eastAsia="Calibri" w:cs="Calibri"/>
-          <w:color w:val="000000"/>
-          <w:sz w:val="19"/>
-          <w:szCs w:val="19"/>
+        <w:rPr/>
+      </w:pPr>
+      <w:r>
+        <w:rPr>
+          <w:rFonts w:ascii="Calibri" w:hAnsi="Calibri" w:eastAsia="Calibri" w:cs="Calibri"/>
+          <w:color w:val="000000"/>
+          <w:sz w:val="19"/>
+          <w:szCs w:val="19"/>
+          <w:lang w:val="en-US"/>
         </w:rPr>
         <w:t>Agilent Technologies – Delaware, USA (HiTech) — RFP support with hands-on exploration of MOSS 2007 SharePoint features.</w:t>
       </w:r>
@@ -4191,13 +4227,15 @@
           <w:numId w:val="2"/>
         </w:numPr>
         <w:spacing w:before="20" w:after="20"/>
-      </w:pPr>
-      <w:r>
-        <w:rPr>
-          <w:rFonts w:ascii="Calibri" w:hAnsi="Calibri" w:eastAsia="Calibri" w:cs="Calibri"/>
-          <w:color w:val="000000"/>
-          <w:sz w:val="19"/>
-          <w:szCs w:val="19"/>
+        <w:rPr/>
+      </w:pPr>
+      <w:r>
+        <w:rPr>
+          <w:rFonts w:ascii="Calibri" w:hAnsi="Calibri" w:eastAsia="Calibri" w:cs="Calibri"/>
+          <w:color w:val="000000"/>
+          <w:sz w:val="19"/>
+          <w:szCs w:val="19"/>
+          <w:lang w:val="en-US"/>
         </w:rPr>
         <w:t>Geologix Inc – Norwich, UK (Energy) — Developed GeoStore, a WITSML-based WCF/NHibernate SOA app for geological data storage/retrieval.</w:t>
       </w:r>
@@ -4312,6 +4350,7 @@
           <w:color w:val="000000"/>
           <w:sz w:val="19"/>
           <w:szCs w:val="19"/>
+          <w:lang w:val="en-US"/>
         </w:rPr>
         <w:t>Bachelor of Science (B.Sc.)</w:t>
       </w:r>
@@ -4324,6 +4363,7 @@
           <w:color w:val="000000"/>
           <w:sz w:val="19"/>
           <w:szCs w:val="19"/>
+          <w:lang w:val="en-US"/>
         </w:rPr>
         <w:t xml:space="preserve">  </w:t>
       </w:r>
@@ -4333,6 +4373,7 @@
           <w:color w:val="000000"/>
           <w:sz w:val="19"/>
           <w:szCs w:val="19"/>
+          <w:lang w:val="en-US"/>
         </w:rPr>
         <w:t>Jul 1997 – Jul 2000</w:t>
       </w:r>

</xml_diff>